<commit_message>
reorganising code and redrawing figures for second submission
</commit_message>
<xml_diff>
--- a/docs/Evidence_use_systematic_map_MS_round_1.docx
+++ b/docs/Evidence_use_systematic_map_MS_round_1.docx
@@ -264,7 +264,19 @@
         <w:rPr>
           <w:rtl w:val="0"/>
         </w:rPr>
-        <w:t xml:space="preserve">. However, despite these efforts, the use of scientific evidence in decision-making remains limited </w:t>
+        <w:t xml:space="preserve">. However, despite these efforts, the use of scientific evidence in decision-making remains limited and poorly </w:t>
+      </w:r>
+      <w:r>
+        <w:rPr>
+          <w:rtl w:val="0"/>
+        </w:rPr>
+        <w:t xml:space="preserve">understood</w:t>
+      </w:r>
+      <w:r>
+        <w:rPr>
+          <w:rtl w:val="0"/>
+        </w:rPr>
+        <w:t xml:space="preserve"> </w:t>
       </w:r>
       <w:r>
         <w:rPr>
@@ -402,7 +414,7 @@
           <w:color w:val="0b5394"/>
           <w:rtl w:val="0"/>
         </w:rPr>
-        <w:t xml:space="preserve"> has led to the increasing popularity of strategies to facilitate the use of scientific evidence in conservation, such as knowledge co-production, in which a collaborative process is used to bring scientists and practitioners together to decide about the relevant questions to be investigated and then bring plural knowledge into the investigation and decision process to tackle conservation problems (Nel et al., 2016).</w:t>
+        <w:t xml:space="preserve"> has led to the increasing popularity of strategies to facilitate the use of scientific evidence in conservation, such as knowledge co-production, in which a collaborative process is used to bring scientists and practitioners together to decide about the relevant questions to be investigated and then integrate plural knowledge into the investigation and decision-making process to tackle conservation problems (Nel et al., 2016).</w:t>
       </w:r>
       <w:r>
         <w:rPr>
@@ -809,7 +821,32 @@
         <w:rPr>
           <w:rtl w:val="0"/>
         </w:rPr>
-        <w:t xml:space="preserve">, which identified 230 factors that facilitate or limit scientific evidence use in conservation management (more detail on this is provided in the data extraction section). The populations of interest were any person involved in the conservation science-practice/policy interface, including researchers, practitioners, policymakers, and other groups. Regarding geographic context, we made no restrictions of where a study could be undertaken.</w:t>
+        <w:t xml:space="preserve">, which identified 230 factors that facilitate or limit scientific evidence use in conservation management (more detail on this is provided in the data extraction section). The populations of interest were any person involved in the conservation science-practice/policy interface, including researchers, practitioners, policymakers, and </w:t>
+      </w:r>
+      <w:sdt>
+        <w:sdtPr>
+          <w:id w:val="39584846"/>
+          <w:tag w:val="goog_rdk_0"/>
+        </w:sdtPr>
+        <w:sdtContent>
+          <w:commentRangeStart w:id="0"/>
+        </w:sdtContent>
+      </w:sdt>
+      <w:r>
+        <w:rPr>
+          <w:rtl w:val="0"/>
+        </w:rPr>
+        <w:t xml:space="preserve">other groups</w:t>
+      </w:r>
+      <w:commentRangeEnd w:id="0"/>
+      <w:r>
+        <w:commentReference w:id="0"/>
+      </w:r>
+      <w:r>
+        <w:rPr>
+          <w:rtl w:val="0"/>
+        </w:rPr>
+        <w:t xml:space="preserve">. Regarding geographic context, we made no restrictions of where a study could be undertaken.</w:t>
       </w:r>
     </w:p>
     <w:p>
@@ -4743,12 +4780,12 @@
           <wp:inline distB="114300" distT="114300" distL="114300" distR="114300">
             <wp:extent cx="5731200" cy="4292600"/>
             <wp:effectExtent b="0" l="0" r="0" t="0"/>
-            <wp:docPr id="1" name="image4.png"/>
+            <wp:docPr id="1" name="image1.png"/>
             <a:graphic>
               <a:graphicData uri="http://schemas.openxmlformats.org/drawingml/2006/picture">
                 <pic:pic>
                   <pic:nvPicPr>
-                    <pic:cNvPr id="0" name="image4.png"/>
+                    <pic:cNvPr id="0" name="image1.png"/>
                     <pic:cNvPicPr preferRelativeResize="0"/>
                   </pic:nvPicPr>
                   <pic:blipFill>
@@ -4872,12 +4909,12 @@
           <wp:inline distB="114300" distT="114300" distL="114300" distR="114300">
             <wp:extent cx="5731200" cy="3441700"/>
             <wp:effectExtent b="0" l="0" r="0" t="0"/>
-            <wp:docPr id="3" name="image1.png"/>
+            <wp:docPr id="3" name="image3.png"/>
             <a:graphic>
               <a:graphicData uri="http://schemas.openxmlformats.org/drawingml/2006/picture">
                 <pic:pic>
                   <pic:nvPicPr>
-                    <pic:cNvPr id="0" name="image1.png"/>
+                    <pic:cNvPr id="0" name="image3.png"/>
                     <pic:cNvPicPr preferRelativeResize="0"/>
                   </pic:nvPicPr>
                   <pic:blipFill>
@@ -4928,35 +4965,35 @@
       </w:r>
       <w:sdt>
         <w:sdtPr>
-          <w:id w:val="-1411898101"/>
-          <w:tag w:val="goog_rdk_0"/>
-        </w:sdtPr>
-        <w:sdtContent>
-          <w:commentRangeStart w:id="0"/>
-        </w:sdtContent>
-      </w:sdt>
-      <w:sdt>
-        <w:sdtPr>
-          <w:id w:val="-1091157222"/>
+          <w:id w:val="-257680695"/>
           <w:tag w:val="goog_rdk_1"/>
         </w:sdtPr>
         <w:sdtContent>
           <w:commentRangeStart w:id="1"/>
         </w:sdtContent>
       </w:sdt>
+      <w:sdt>
+        <w:sdtPr>
+          <w:id w:val="1954667955"/>
+          <w:tag w:val="goog_rdk_2"/>
+        </w:sdtPr>
+        <w:sdtContent>
+          <w:commentRangeStart w:id="2"/>
+        </w:sdtContent>
+      </w:sdt>
       <w:r>
         <w:rPr>
           <w:rtl w:val="0"/>
         </w:rPr>
         <w:t xml:space="preserve">(b) </w:t>
       </w:r>
-      <w:commentRangeEnd w:id="0"/>
-      <w:r>
-        <w:commentReference w:id="0"/>
-      </w:r>
       <w:commentRangeEnd w:id="1"/>
       <w:r>
         <w:commentReference w:id="1"/>
+      </w:r>
+      <w:commentRangeEnd w:id="2"/>
+      <w:r>
+        <w:commentReference w:id="2"/>
       </w:r>
       <w:r>
         <w:rPr>
@@ -5006,12 +5043,12 @@
           <wp:inline distB="114300" distT="114300" distL="114300" distR="114300">
             <wp:extent cx="5731200" cy="4013200"/>
             <wp:effectExtent b="0" l="0" r="0" t="0"/>
-            <wp:docPr id="2" name="image3.png"/>
+            <wp:docPr id="2" name="image2.png"/>
             <a:graphic>
               <a:graphicData uri="http://schemas.openxmlformats.org/drawingml/2006/picture">
                 <pic:pic>
                   <pic:nvPicPr>
-                    <pic:cNvPr id="0" name="image3.png"/>
+                    <pic:cNvPr id="0" name="image2.png"/>
                     <pic:cNvPicPr preferRelativeResize="0"/>
                   </pic:nvPicPr>
                   <pic:blipFill>
@@ -5082,8 +5119,8 @@
       </w:r>
       <w:sdt>
         <w:sdtPr>
-          <w:id w:val="192132281"/>
-          <w:tag w:val="goog_rdk_2"/>
+          <w:id w:val="1039361382"/>
+          <w:tag w:val="goog_rdk_3"/>
         </w:sdtPr>
         <w:sdtContent>
           <w:r>
@@ -5122,7 +5159,29 @@
         <w:rPr>
           <w:rtl w:val="0"/>
         </w:rPr>
-        <w:t xml:space="preserve">Factors relating to the characteristics of scientific evidence were the most commonly studied, compared to other thematic categories. Approximately half of studies identified relevance of the evidence as important (47.9%, n=81studies, Figure 3b). The format and language (i.e. the format - such as peer-reviewed studies, reports, or presentations - and style of language in which evidence is presented, 31.4%, n=53), rigour (29.6%, n=50), the accessibility of evidence (29.0%, n=49), and uncertainty (21.9%, n=37) were also frequently mentioned in studies. Factors such as the existence of evidence, the source of the evidence, the spatial or temporal scale of the evidence and time lags associated with evidence production were mentioned moderately frequently, with 10-20% studies citing them as factors influencing evidence use (Figure 3b). Meanwhile, the quantity of information, language barriers, conclusiveness, and difficulty in finding the evidence were mentioned in fewer than 10% of studies (Figure 3b).</w:t>
+        <w:t xml:space="preserve">Factors relating to the characteristics of scientific evidence were the most commonly studied, compared to other thematic categories. Approximately half of studies identified relevance of the evidence as important (47.9%, n=81studies, Figure 3b). The format and language (i.e. the format - such as peer-reviewed studies, reports, or presentations - and style of language in which evidence is presented, 31.4%, n=53), rigour (29.6%, n=50), the accessibility of evidence (29.0%, n=49), and uncertainty (21.9%, n=37) were also frequently mentioned in studies. Factors such as the existence of evidence, the source of the evidence, the spatial or temporal scale of the evidence and time lags associated with evidence production were mentioned moderately</w:t>
+      </w:r>
+      <w:sdt>
+        <w:sdtPr>
+          <w:id w:val="-722044896"/>
+          <w:tag w:val="goog_rdk_4"/>
+        </w:sdtPr>
+        <w:sdtContent>
+          <w:del w:author="Cátia Matos" w:id="0" w:date="2026-06-09T10:39:09Z">
+            <w:r>
+              <w:rPr>
+                <w:rtl w:val="0"/>
+              </w:rPr>
+              <w:delText xml:space="preserve"> frequently</w:delText>
+            </w:r>
+          </w:del>
+        </w:sdtContent>
+      </w:sdt>
+      <w:r>
+        <w:rPr>
+          <w:rtl w:val="0"/>
+        </w:rPr>
+        <w:t xml:space="preserve">, with 10-20% studies citing them as factors influencing evidence use (Figure 3b). Meanwhile, the quantity of information, language barriers, conclusiveness, and difficulty in finding the evidence were mentioned in fewer than 10% of studies (Figure 3b).</w:t>
       </w:r>
     </w:p>
     <w:p>
@@ -5154,12 +5213,12 @@
           <wp:inline distB="114300" distT="114300" distL="114300" distR="114300">
             <wp:extent cx="5731200" cy="4305300"/>
             <wp:effectExtent b="0" l="0" r="0" t="0"/>
-            <wp:docPr id="4" name="image2.png"/>
+            <wp:docPr id="4" name="image4.png"/>
             <a:graphic>
               <a:graphicData uri="http://schemas.openxmlformats.org/drawingml/2006/picture">
                 <pic:pic>
                   <pic:nvPicPr>
-                    <pic:cNvPr id="0" name="image2.png"/>
+                    <pic:cNvPr id="0" name="image4.png"/>
                     <pic:cNvPicPr preferRelativeResize="0"/>
                   </pic:nvPicPr>
                   <pic:blipFill>
@@ -5260,19 +5319,14 @@
       </w:pPr>
       <w:sdt>
         <w:sdtPr>
-          <w:id w:val="670176910"/>
-          <w:tag w:val="goog_rdk_3"/>
+          <w:id w:val="146996387"/>
+          <w:tag w:val="goog_rdk_5"/>
         </w:sdtPr>
         <w:sdtContent>
           <w:r>
             <w:rPr>
               <w:rFonts w:ascii="Arial Unicode MS" w:cs="Arial Unicode MS" w:eastAsia="Arial Unicode MS" w:hAnsi="Arial Unicode MS"/>
               <w:rtl w:val="0"/>
-              <w:rPrChange w:author="Santiago Perea Arroyo" w:id="0" w:date="2026-06-04T21:40:37Z">
-                <w:rPr>
-                  <w:rFonts w:ascii="Arial Unicode MS" w:cs="Arial Unicode MS" w:eastAsia="Arial Unicode MS" w:hAnsi="Arial Unicode MS"/>
-                </w:rPr>
-              </w:rPrChange>
             </w:rPr>
             <w:t xml:space="preserve">Our results show that the most frequently identified factors impacting the use of scientific evidence in conservation practice and policy are relationships between scientists and practitioners/policymakers, the relevance of scientific evidence, and the capacity and resources of policy or practice organisations users of the evidence - each mentioned in ≥35% of studies. </w:t>
           </w:r>
@@ -5282,1190 +5336,1133 @@
         <w:rPr>
           <w:rtl w:val="0"/>
         </w:rPr>
-        <w:t xml:space="preserve">Beyond </w:t>
+        <w:t xml:space="preserve">Beyond this top three, studies often noted the importance of the practitioner and policymaker characteristics, such as their technical skills and attitude towards evidence use, as well as factors associated with the broader decision-making context, such as social, economic, and political conditions. Evidence-related factors were also commonly reported, particularly accessibility, rigour, and the format and style of language in which the information is communicated. In contrast, relatively few studies identified factors associated with researchers as impacting the use of scientific evidence. </w:t>
+      </w:r>
+    </w:p>
+    <w:p>
+      <w:pPr>
+        <w:spacing w:line="480" w:lineRule="auto"/>
+        <w:rPr/>
+      </w:pPr>
+      <w:r>
+        <w:rPr>
+          <w:rtl w:val="0"/>
+        </w:rPr>
+      </w:r>
+    </w:p>
+    <w:p>
+      <w:pPr>
+        <w:spacing w:line="480" w:lineRule="auto"/>
+        <w:rPr/>
+      </w:pPr>
+      <w:r>
+        <w:rPr>
+          <w:rtl w:val="0"/>
+        </w:rPr>
+        <w:t xml:space="preserve">These results are remarkably consistent with those of the much larger review of Oliver et al </w:t>
+      </w:r>
+      <w:r>
+        <w:rPr>
+          <w:color w:val="000000"/>
+          <w:rtl w:val="0"/>
+        </w:rPr>
+        <w:t xml:space="preserve">(2026)</w:t>
+      </w:r>
+      <w:r>
+        <w:rPr>
+          <w:rtl w:val="0"/>
+        </w:rPr>
+        <w:t xml:space="preserve">, who synthesised factors influencing evidence use from 2199 studies across a broad range of fields such as public health, health care, climate change policy, and education. Like our review, Oliver et al </w:t>
+      </w:r>
+      <w:r>
+        <w:rPr>
+          <w:color w:val="000000"/>
+          <w:rtl w:val="0"/>
+        </w:rPr>
+        <w:t xml:space="preserve">(2026)</w:t>
+      </w:r>
+      <w:r>
+        <w:rPr>
+          <w:rtl w:val="0"/>
+        </w:rPr>
+        <w:t xml:space="preserve"> identified relevance, staff and resources, communication and relations between practitioners and scientists, and accessibility of evidence as key to evidence being used to inform policy and practice. Together, these patterns suggest that evidence use is shaped less by the availability of scientific knowledge than by how evidence is embedded within organisational settings, decision processes, and professional relationships. The results of our study are also similar to those of the smaller review of Kadykalo et al </w:t>
+      </w:r>
+      <w:r>
+        <w:rPr>
+          <w:color w:val="000000"/>
+          <w:rtl w:val="0"/>
+        </w:rPr>
+        <w:t xml:space="preserve">(2021)</w:t>
+      </w:r>
+      <w:r>
+        <w:rPr>
+          <w:rtl w:val="0"/>
+        </w:rPr>
+        <w:t xml:space="preserve"> who found that evidence relevance, accessibility, organisational capacity and resources, time limitations, and researchers' communication skills were all common barriers to the use of evidence in conservation.</w:t>
+      </w:r>
+    </w:p>
+    <w:p>
+      <w:pPr>
+        <w:spacing w:line="480" w:lineRule="auto"/>
+        <w:rPr/>
+      </w:pPr>
+      <w:r>
+        <w:rPr>
+          <w:rtl w:val="0"/>
+        </w:rPr>
+      </w:r>
+    </w:p>
+    <w:p>
+      <w:pPr>
+        <w:spacing w:line="480" w:lineRule="auto"/>
+        <w:rPr>
+          <w:color w:val="0b5394"/>
+        </w:rPr>
+      </w:pPr>
+      <w:r>
+        <w:rPr>
+          <w:color w:val="0b5394"/>
+          <w:rtl w:val="0"/>
+        </w:rPr>
+        <w:t xml:space="preserve">Our results also indicate biases in the evidence-use literature, with a focus on Global North English-speaking countries such as the USA, Australia, and Canada; a tendency for studies to focus primarily on practitioners, with policymakers consulted relatively rarely; and a predominance of studies examining governmental and statutory bodies. However, we also acknowledge that the relative lack of studies in non-English speaking countries may be partially attributable to our study methods, which only searched for literature in English. In addition, Global North English-speaking countries also include a large number of research-intensive universities and conservation organisations, which may also partially explain the patterns seen. Despite the relative lack of studies, practitioners and policymakers in the Global South may experience similar barriers to evidence use as those found in English-speaking countries in the Global North. However, future research should aim to identify whether there are unique factors that impede the use of evidence in the Global South, such as political and resource constraints, </w:t>
+      </w:r>
+      <w:r>
+        <w:rPr>
+          <w:color w:val="0b5394"/>
+          <w:rtl w:val="0"/>
+        </w:rPr>
+        <w:t xml:space="preserve">limited access to databases and scientific studies, or poor internet connectivity.</w:t>
+      </w:r>
+      <w:r>
+        <w:rPr>
+          <w:color w:val="0b5394"/>
+          <w:rtl w:val="0"/>
+        </w:rPr>
+        <w:t xml:space="preserve"> </w:t>
+      </w:r>
+    </w:p>
+    <w:p>
+      <w:pPr>
+        <w:spacing w:line="480" w:lineRule="auto"/>
+        <w:rPr>
+          <w:color w:val="0b5394"/>
+        </w:rPr>
+      </w:pPr>
+      <w:r>
+        <w:rPr>
+          <w:rtl w:val="0"/>
+        </w:rPr>
+      </w:r>
+    </w:p>
+    <w:p>
+      <w:pPr>
+        <w:spacing w:line="480" w:lineRule="auto"/>
+        <w:rPr>
+          <w:color w:val="0b5394"/>
+        </w:rPr>
+      </w:pPr>
+      <w:r>
+        <w:rPr>
+          <w:color w:val="0b5394"/>
+          <w:rtl w:val="0"/>
+        </w:rPr>
+        <w:t xml:space="preserve">Many of the studies we identified did not report the ecosystem type or conservation threat that organisations focused on. Rather than purely being indicative of a lack of reporting by researchers, </w:t>
+      </w:r>
+      <w:r>
+        <w:rPr>
+          <w:color w:val="0b5394"/>
+          <w:rtl w:val="0"/>
+        </w:rPr>
+        <w:t xml:space="preserve">this</w:t>
+      </w:r>
+      <w:r>
+        <w:rPr>
+          <w:color w:val="0b5394"/>
+          <w:rtl w:val="0"/>
+        </w:rPr>
+        <w:t xml:space="preserve"> likely reflects the breadth of most primary studies, which normally focused on multiple conservation organisations, that worked in a wide range of different ecosystems and dealt with a variety of conservation threats. This is reflected by the large number of government and statutory bodies which were the focus of studies and the fact that around 50% of decision contexts studied were related to regional to international scales. However, given the importance of context in how evidence is used, we urge researchers on this topic to provide more detailed descriptions of the contexts in which studies were undertaken. Doing this would allow for a comparison of how the factors impacting the use of scientific evidence vary across contexts and identification of topics for which more research is needed or not, thereby reducing research waste (Grainger et al., 2020; Purgar et al., 2022).</w:t>
+      </w:r>
+    </w:p>
+    <w:p>
+      <w:pPr>
+        <w:spacing w:line="480" w:lineRule="auto"/>
+        <w:rPr>
+          <w:b w:val="1"/>
+          <w:bCs w:val="1"/>
+        </w:rPr>
+      </w:pPr>
+      <w:r>
+        <w:rPr>
+          <w:rtl w:val="0"/>
+        </w:rPr>
+      </w:r>
+    </w:p>
+    <w:p>
+      <w:pPr>
+        <w:spacing w:line="480" w:lineRule="auto"/>
+        <w:rPr/>
+      </w:pPr>
+      <w:r>
+        <w:rPr>
+          <w:b w:val="1"/>
+          <w:bCs w:val="1"/>
+          <w:rtl w:val="0"/>
+        </w:rPr>
+        <w:t xml:space="preserve">Factors influencing scientific evidence use </w:t>
+      </w:r>
+      <w:r>
+        <w:rPr>
+          <w:rtl w:val="0"/>
+        </w:rPr>
+      </w:r>
+    </w:p>
+    <w:p>
+      <w:pPr>
+        <w:spacing w:line="480" w:lineRule="auto"/>
+        <w:rPr>
+          <w:color w:val="0b5394"/>
+        </w:rPr>
+      </w:pPr>
+      <w:r>
+        <w:rPr>
+          <w:rtl w:val="0"/>
+        </w:rPr>
+        <w:t xml:space="preserve">A large proportion of primary studies identified characteristics of scientific evidence itself as influencing its use. Relevance was particularly prominent amongst these and is a recurring theme in conservation, where biodiversity outcomes from management can be highly context dependent </w:t>
+      </w:r>
+      <w:r>
+        <w:rPr>
+          <w:color w:val="000000"/>
+          <w:rtl w:val="0"/>
+        </w:rPr>
+        <w:t xml:space="preserve">(Cook et al., 2013)</w:t>
+      </w:r>
+      <w:r>
+        <w:rPr>
+          <w:rtl w:val="0"/>
+        </w:rPr>
+        <w:t xml:space="preserve">. What determined relevance was rarely defined, but the studies often mentioned that data available at large scales were not relevant to local scale decisions </w:t>
+      </w:r>
+      <w:r>
+        <w:rPr>
+          <w:color w:val="000000"/>
+          <w:rtl w:val="0"/>
+        </w:rPr>
+        <w:t xml:space="preserve">(Gagné et al., 2020; Jacaban et al., 2022; Miljand &amp; Eckerberg, 2022; Rasmussen et al., 2017)</w:t>
+      </w:r>
+      <w:r>
+        <w:rPr>
+          <w:rtl w:val="0"/>
+        </w:rPr>
+        <w:t xml:space="preserve">. As such, relevance is likely influenced by the ecological, cultural and socioeconomic similarities between the contexts in which scientific evidence is generated and the decision context </w:t>
+      </w:r>
+      <w:r>
+        <w:rPr>
+          <w:color w:val="000000"/>
+          <w:rtl w:val="0"/>
+        </w:rPr>
+        <w:t xml:space="preserve">(Adams &amp; Sandbrook, 2013; Christie et al., 2020, 2023)</w:t>
+      </w:r>
+      <w:r>
+        <w:rPr>
+          <w:rtl w:val="0"/>
+        </w:rPr>
+        <w:t xml:space="preserve">. </w:t>
+      </w:r>
+      <w:r>
+        <w:rPr>
+          <w:rtl w:val="0"/>
+        </w:rPr>
+        <w:t xml:space="preserve">The format and style of language used to communicate scientific evidence was frequently cited as influencing evidence use, which reflects scientists’ training to write for disciplinary specialists using technical language </w:t>
+      </w:r>
+      <w:r>
+        <w:rPr>
+          <w:color w:val="000000"/>
+          <w:rtl w:val="0"/>
+        </w:rPr>
+        <w:t xml:space="preserve">(Fazey et al., 2005)</w:t>
+      </w:r>
+      <w:r>
+        <w:rPr>
+          <w:rtl w:val="0"/>
+        </w:rPr>
+        <w:t xml:space="preserve">, but can limit the interpretability and usability of evidence for practitioners and policymakers </w:t>
+      </w:r>
+      <w:r>
+        <w:rPr>
+          <w:color w:val="000000"/>
+          <w:rtl w:val="0"/>
+        </w:rPr>
+        <w:t xml:space="preserve">(Barrett &amp; Rodriguez, 2021; Cvitanovic et al., 2016; Karam-Gemael et al., 2018)</w:t>
+      </w:r>
+      <w:r>
+        <w:rPr>
+          <w:rtl w:val="0"/>
+        </w:rPr>
+        <w:t xml:space="preserve">. </w:t>
+      </w:r>
+      <w:r>
+        <w:rPr>
+          <w:rtl w:val="0"/>
+        </w:rPr>
+        <w:t xml:space="preserve">Accessibility of evidence was frequently mentioned in studies and reviews and has long been recognised as influencing evidence use (Pullin et al., 2004), but remains a problem due both to paywalls and difficulties in finding information </w:t>
+      </w:r>
+      <w:r>
+        <w:rPr>
+          <w:color w:val="000000"/>
+          <w:rtl w:val="0"/>
+        </w:rPr>
+        <w:t xml:space="preserve">(Cook et al., 2012; Fabian et al., 2019; Walsh et al., 2019)</w:t>
+      </w:r>
+      <w:r>
+        <w:rPr>
+          <w:rtl w:val="0"/>
+        </w:rPr>
+        <w:t xml:space="preserve">. </w:t>
+      </w:r>
+      <w:r>
+        <w:rPr>
+          <w:color w:val="0b5394"/>
+          <w:rtl w:val="0"/>
+        </w:rPr>
+        <w:t xml:space="preserve">The rigour of evidence was regularly highlighted as influencing its uptake, mainly noting the perceived trustworthiness of scientific evidence (Lemieux et al., 2018). However, in contrast, a number of studies highlighted the concerns of decision-makers that data generated by models (Peters et al., 2018) and by citizen science (Suškevičs et al., 2021) may be less trustworthy than empirical data collected by trained scientists.</w:t>
+      </w:r>
+    </w:p>
+    <w:p>
+      <w:pPr>
+        <w:spacing w:line="480" w:lineRule="auto"/>
+        <w:rPr>
+          <w:b w:val="1"/>
+          <w:bCs w:val="1"/>
+        </w:rPr>
+      </w:pPr>
+      <w:r>
+        <w:rPr>
+          <w:rtl w:val="0"/>
+        </w:rPr>
+      </w:r>
+    </w:p>
+    <w:p>
+      <w:pPr>
+        <w:spacing w:line="480" w:lineRule="auto"/>
+        <w:rPr/>
+      </w:pPr>
+      <w:r>
+        <w:rPr>
+          <w:rtl w:val="0"/>
+        </w:rPr>
+        <w:t xml:space="preserve">The importance of relationships in shaping decision processes is well recognised </w:t>
+      </w:r>
+      <w:r>
+        <w:rPr>
+          <w:color w:val="000000"/>
+          <w:rtl w:val="0"/>
+        </w:rPr>
+        <w:t xml:space="preserve">(Gray, 2016; Noble &amp; Fulton, 2020; Walsh et al., 2019)</w:t>
+      </w:r>
+      <w:r>
+        <w:rPr>
+          <w:rtl w:val="0"/>
+        </w:rPr>
+        <w:t xml:space="preserve"> and our results reflect the vital role of relationships between researchers and practitioners/policymakers. Decisions are not made through neutral application of information, but are embedded within social interactions, norms, and expectations between actors </w:t>
+      </w:r>
+      <w:r>
+        <w:rPr>
+          <w:color w:val="000000"/>
+          <w:rtl w:val="0"/>
+        </w:rPr>
+        <w:t xml:space="preserve">(Lejano, 2021)</w:t>
+      </w:r>
+      <w:r>
+        <w:rPr>
+          <w:rtl w:val="0"/>
+        </w:rPr>
+        <w:t xml:space="preserve">. One key aspect of relationships between scientists and practitioners/policymakers was simply whether there was any contact and communication at all </w:t>
+      </w:r>
+      <w:r>
+        <w:rPr>
+          <w:color w:val="000000"/>
+          <w:rtl w:val="0"/>
+        </w:rPr>
+        <w:t xml:space="preserve">(Yocum et al., 2022)</w:t>
+      </w:r>
+      <w:r>
+        <w:rPr>
+          <w:rtl w:val="0"/>
+        </w:rPr>
+        <w:t xml:space="preserve">, which often facilitated overcoming barriers such as lack of access to evidence or difficulty in understanding technical language </w:t>
+      </w:r>
+      <w:r>
+        <w:rPr>
+          <w:color w:val="000000"/>
+          <w:rtl w:val="0"/>
+        </w:rPr>
+        <w:t xml:space="preserve">(Noble &amp; Fulton, 2020)</w:t>
+      </w:r>
+      <w:r>
+        <w:rPr>
+          <w:rtl w:val="0"/>
+        </w:rPr>
+        <w:t xml:space="preserve">. Additionally, </w:t>
       </w:r>
       <w:sdt>
         <w:sdtPr>
-          <w:id w:val="-867727717"/>
-          <w:tag w:val="goog_rdk_4"/>
+          <w:id w:val="-1907744736"/>
+          <w:tag w:val="goog_rdk_6"/>
         </w:sdtPr>
         <w:sdtContent>
-          <w:ins w:author="Santiago Perea Arroyo" w:id="1" w:date="2026-06-04T21:39:52Z"/>
-          <w:sdt>
-            <w:sdtPr>
-              <w:id w:val="1461020140"/>
-              <w:tag w:val="goog_rdk_5"/>
-            </w:sdtPr>
-            <w:sdtContent>
-              <w:ins w:author="Santiago Perea Arroyo" w:id="1" w:date="2026-06-04T21:39:52Z">
-                <w:r>
-                  <w:rPr>
-                    <w:rtl w:val="0"/>
-                    <w:rPrChange w:author="Santiago Perea Arroyo" w:id="2" w:date="2026-06-04T21:39:52Z">
-                      <w:rPr/>
-                    </w:rPrChange>
-                  </w:rPr>
-                  <w:t xml:space="preserve">these</w:t>
-                </w:r>
-              </w:ins>
-            </w:sdtContent>
-          </w:sdt>
-          <w:ins w:author="Santiago Perea Arroyo" w:id="1" w:date="2026-06-04T21:39:52Z"/>
+          <w:commentRangeStart w:id="3"/>
+        </w:sdtContent>
+      </w:sdt>
+      <w:r>
+        <w:rPr>
+          <w:rtl w:val="0"/>
+        </w:rPr>
+        <w:t xml:space="preserve">trust in researchers and the research they produce plays an important role in shaping perceptions of the credibility and legitimacy of scientific evidence and the recommendations derived from it</w:t>
+      </w:r>
+      <w:commentRangeEnd w:id="3"/>
+      <w:r>
+        <w:commentReference w:id="3"/>
+      </w:r>
+      <w:r>
+        <w:rPr>
+          <w:rtl w:val="0"/>
+        </w:rPr>
+        <w:t xml:space="preserve">. Our findings therefore align with broader literature suggesting that relationships act as an enabling condition for evidence use, rather than a substitute for evidence quality or relevance</w:t>
+      </w:r>
+      <w:sdt>
+        <w:sdtPr>
+          <w:id w:val="-550116547"/>
+          <w:tag w:val="goog_rdk_7"/>
+        </w:sdtPr>
+        <w:sdtContent>
+          <w:commentRangeStart w:id="4"/>
         </w:sdtContent>
       </w:sdt>
       <w:sdt>
         <w:sdtPr>
-          <w:id w:val="-896542321"/>
-          <w:tag w:val="goog_rdk_6"/>
-        </w:sdtPr>
-        <w:sdtContent>
-          <w:del w:author="Santiago Perea Arroyo" w:id="1" w:date="2026-06-04T21:39:52Z"/>
-          <w:sdt>
-            <w:sdtPr>
-              <w:id w:val="18865769"/>
-              <w:tag w:val="goog_rdk_7"/>
-            </w:sdtPr>
-            <w:sdtContent>
-              <w:del w:author="Santiago Perea Arroyo" w:id="1" w:date="2026-06-04T21:39:52Z">
-                <w:r>
-                  <w:rPr>
-                    <w:rtl w:val="0"/>
-                    <w:rPrChange w:author="Santiago Perea Arroyo" w:id="2" w:date="2026-06-04T21:39:52Z">
-                      <w:rPr/>
-                    </w:rPrChange>
-                  </w:rPr>
-                  <w:delText xml:space="preserve">this</w:delText>
-                </w:r>
-              </w:del>
-            </w:sdtContent>
-          </w:sdt>
-          <w:del w:author="Santiago Perea Arroyo" w:id="1" w:date="2026-06-04T21:39:52Z"/>
-        </w:sdtContent>
-      </w:sdt>
-      <w:r>
-        <w:rPr>
-          <w:rtl w:val="0"/>
-        </w:rPr>
-        <w:t xml:space="preserve"> top three, studies often noted the importance of the practitioner and policymaker characteristics, such as their technical skills and attitude towards evidence use, as well as factors associated with the broader decision-making context, such as social, economic, and political conditions. Evidence-related factors were also commonly reported, particularly accessibility, rigour, and the format and style of language in which the information is communicated. In contrast, relatively few studies identified factors associated with researchers as impacting the use of scientific evidence. </w:t>
-      </w:r>
-    </w:p>
-    <w:p>
-      <w:pPr>
-        <w:spacing w:line="480" w:lineRule="auto"/>
-        <w:rPr/>
-      </w:pPr>
-      <w:r>
-        <w:rPr>
-          <w:rtl w:val="0"/>
-        </w:rPr>
-      </w:r>
-    </w:p>
-    <w:p>
-      <w:pPr>
-        <w:spacing w:line="480" w:lineRule="auto"/>
-        <w:rPr/>
-      </w:pPr>
-      <w:r>
-        <w:rPr>
-          <w:rtl w:val="0"/>
-        </w:rPr>
-        <w:t xml:space="preserve">These results are remarkably consistent with those of the much larger review of Oliver et al </w:t>
-      </w:r>
-      <w:r>
-        <w:rPr>
-          <w:color w:val="000000"/>
-          <w:rtl w:val="0"/>
-        </w:rPr>
-        <w:t xml:space="preserve">(2026)</w:t>
-      </w:r>
-      <w:r>
-        <w:rPr>
-          <w:rtl w:val="0"/>
-        </w:rPr>
-        <w:t xml:space="preserve">, who synthesised factors influencing evidence use from 2199 studies across a broad range of fields such as public health, health care, climate change policy, and education. Like our review, Oliver et al </w:t>
-      </w:r>
-      <w:r>
-        <w:rPr>
-          <w:color w:val="000000"/>
-          <w:rtl w:val="0"/>
-        </w:rPr>
-        <w:t xml:space="preserve">(2026)</w:t>
-      </w:r>
-      <w:r>
-        <w:rPr>
-          <w:rtl w:val="0"/>
-        </w:rPr>
-        <w:t xml:space="preserve"> identified relevance, staff and resources, communication and relations between practitioners and scientists, and accessibility of evidence as key to evidence being used to inform policy and practice. Together, these patterns suggest that evidence use is shaped less by the availability of scientific knowledge than by how evidence is embedded within organisational settings, decision processes, and professional relationships. The results of our study are also similar to those of the smaller review of Kadykalo et al </w:t>
-      </w:r>
-      <w:r>
-        <w:rPr>
-          <w:color w:val="000000"/>
-          <w:rtl w:val="0"/>
-        </w:rPr>
-        <w:t xml:space="preserve">(2021)</w:t>
-      </w:r>
-      <w:r>
-        <w:rPr>
-          <w:rtl w:val="0"/>
-        </w:rPr>
-        <w:t xml:space="preserve"> who found that evidence relevance, accessibility, organisational capacity and resources, time limitations, and researchers' communication skills were all common barriers to the use of evidence in conservation.</w:t>
-      </w:r>
-    </w:p>
-    <w:p>
-      <w:pPr>
-        <w:spacing w:line="480" w:lineRule="auto"/>
-        <w:rPr/>
-      </w:pPr>
-      <w:r>
-        <w:rPr>
-          <w:rtl w:val="0"/>
-        </w:rPr>
-      </w:r>
-    </w:p>
-    <w:p>
-      <w:pPr>
-        <w:spacing w:line="480" w:lineRule="auto"/>
-        <w:rPr>
-          <w:color w:val="0b5394"/>
-        </w:rPr>
-      </w:pPr>
-      <w:r>
-        <w:rPr>
-          <w:color w:val="0b5394"/>
-          <w:rtl w:val="0"/>
-        </w:rPr>
-        <w:t xml:space="preserve">Our results also indicate biases in the evidence-use literature, with a focus on Global North English-speaking countries such as the USA, Australia, and Canada; a tendency for studies to focus primarily on practitioners, with policymakers consulted relatively rarely; and a predominance of studies examining governmental and statutory bodies. However, we also acknowledge that the relative lack of studies in non-English speaking countries may be partially attributable to our study methods, which only searched for literature in English. In addition, Global North English-speaking countries also include a large number of research-intensive universities and conservation organisations, which may also partially explain the patterns seen. Despite the relative lack of studies, practitioners and policymakers in the Global South may experience similar barriers to evidence use as those found in English-speaking countries in the Global North</w:t>
-      </w:r>
-      <w:sdt>
-        <w:sdtPr>
-          <w:id w:val="-257435601"/>
+          <w:id w:val="1458365691"/>
           <w:tag w:val="goog_rdk_8"/>
         </w:sdtPr>
         <w:sdtContent>
-          <w:ins w:author="Santiago Perea Arroyo" w:id="3" w:date="2026-06-04T21:42:35Z">
+          <w:commentRangeStart w:id="5"/>
+        </w:sdtContent>
+      </w:sdt>
+      <w:r>
+        <w:rPr>
+          <w:rtl w:val="0"/>
+        </w:rPr>
+        <w:t xml:space="preserve">.</w:t>
+      </w:r>
+      <w:commentRangeEnd w:id="4"/>
+      <w:r>
+        <w:commentReference w:id="4"/>
+      </w:r>
+      <w:commentRangeEnd w:id="5"/>
+      <w:r>
+        <w:commentReference w:id="5"/>
+      </w:r>
+      <w:r>
+        <w:rPr>
+          <w:rtl w:val="0"/>
+        </w:rPr>
+      </w:r>
+    </w:p>
+    <w:p>
+      <w:pPr>
+        <w:spacing w:line="480" w:lineRule="auto"/>
+        <w:rPr/>
+      </w:pPr>
+      <w:r>
+        <w:rPr>
+          <w:rtl w:val="0"/>
+        </w:rPr>
+      </w:r>
+    </w:p>
+    <w:p>
+      <w:pPr>
+        <w:spacing w:line="480" w:lineRule="auto"/>
+        <w:rPr/>
+      </w:pPr>
+      <w:r>
+        <w:rPr>
+          <w:rtl w:val="0"/>
+        </w:rPr>
+        <w:t xml:space="preserve">Our results indicate that organisational factors, individual capacity, and decision context play key roles in shaping the use of scientific evidence. In particular, the influence of organisational capacity and resources is likely to be a major constraint. Most conservation organisations operate with limited funding and small teams </w:t>
+      </w:r>
+      <w:r>
+        <w:rPr>
+          <w:color w:val="000000"/>
+          <w:rtl w:val="0"/>
+        </w:rPr>
+        <w:t xml:space="preserve">(Armsworth et al., 2012)</w:t>
+      </w:r>
+      <w:r>
+        <w:rPr>
+          <w:rtl w:val="0"/>
+        </w:rPr>
+        <w:t xml:space="preserve">, leaving staff with little time to search for, interpret, and apply scientific evidence. Linked to this, many staff in conservation organisations also feel that they lack the technical skills to read and interpret scientific evidence, with evidence use often more common among practitioners with higher levels of formal education or scientific training </w:t>
+      </w:r>
+      <w:r>
+        <w:rPr>
+          <w:color w:val="000000"/>
+          <w:rtl w:val="0"/>
+        </w:rPr>
+        <w:t xml:space="preserve">(Lemieux et al., 2018)</w:t>
+      </w:r>
+      <w:r>
+        <w:rPr>
+          <w:rtl w:val="0"/>
+        </w:rPr>
+        <w:t xml:space="preserve">. The social, political, and economic context was also frequently cited in studies we found, reflecting the fact that the wider decision-context is important in determining whether scientific evidence informs practice and policy. Use of evidence on topics that are politically contentious in some contexts, such as the use of climate change data for conservation strategies in US states, highlight this issue </w:t>
+      </w:r>
+      <w:r>
+        <w:rPr>
+          <w:color w:val="000000"/>
+          <w:rtl w:val="0"/>
+        </w:rPr>
+        <w:t xml:space="preserve">(Peters et al., 2018; Rasmussen et al., 2017; Yocum et al., 2022)</w:t>
+      </w:r>
+      <w:r>
+        <w:rPr>
+          <w:rtl w:val="0"/>
+        </w:rPr>
+        <w:t xml:space="preserve">.</w:t>
+      </w:r>
+    </w:p>
+    <w:p>
+      <w:pPr>
+        <w:spacing w:after="240" w:before="240" w:line="480" w:lineRule="auto"/>
+        <w:rPr>
+          <w:b w:val="1"/>
+          <w:bCs w:val="1"/>
+        </w:rPr>
+      </w:pPr>
+      <w:r>
+        <w:rPr>
+          <w:rtl w:val="0"/>
+        </w:rPr>
+        <w:t xml:space="preserve">Relatively few studies identified factors associated with the characteristics of researchers and research organisations as influencing the use of scientific evidence. This is somewhat surprising given long-standing concerns that academic incentive structures prioritise novel findings and high-impact journals (Shanley &amp; López, 2009) and disadvantage the production of policy- or practice-relevant evidence (Dedeurwaerdere et al., 2026). We found that researchers’ knowledge of policy and practice was relatively frequently cited, aligning with previous work showing that researchers’ perceptions of what constitutes relevant or useful evidence often differ substantially from those of practitioners and policymakers (Cook, Mascia, et al., 2013). However, the limited attention paid to researcher and research organisation characteristics in the conservation evidence-use literature does not indicate that they are unimportant, but should be seen as a knowledge gap and research priority.</w:t>
+      </w:r>
+      <w:r>
+        <w:rPr>
+          <w:rtl w:val="0"/>
+        </w:rPr>
+      </w:r>
+    </w:p>
+    <w:p>
+      <w:pPr>
+        <w:spacing w:line="480" w:lineRule="auto"/>
+        <w:rPr>
+          <w:b w:val="1"/>
+          <w:bCs w:val="1"/>
+        </w:rPr>
+      </w:pPr>
+      <w:r>
+        <w:rPr>
+          <w:rtl w:val="0"/>
+        </w:rPr>
+      </w:r>
+    </w:p>
+    <w:p>
+      <w:pPr>
+        <w:spacing w:line="480" w:lineRule="auto"/>
+        <w:rPr/>
+      </w:pPr>
+      <w:r>
+        <w:rPr>
+          <w:b w:val="1"/>
+          <w:bCs w:val="1"/>
+          <w:rtl w:val="0"/>
+        </w:rPr>
+        <w:t xml:space="preserve">Potential solutions</w:t>
+      </w:r>
+      <w:r>
+        <w:rPr>
+          <w:rtl w:val="0"/>
+        </w:rPr>
+      </w:r>
+    </w:p>
+    <w:p>
+      <w:pPr>
+        <w:spacing w:line="480" w:lineRule="auto"/>
+        <w:rPr/>
+      </w:pPr>
+      <w:r>
+        <w:rPr>
+          <w:rtl w:val="0"/>
+        </w:rPr>
+        <w:t xml:space="preserve">Given the diversity and interrelatedness of the factors influencing the use of scientific evidence, the conservation sector must focus on delivering cross-cutting solutions that address multiple barriers. One such widely recognised cross-cutting solution is the use of knowledge co-production and participatory approaches </w:t>
+      </w:r>
+      <w:r>
+        <w:rPr>
+          <w:color w:val="000000"/>
+          <w:rtl w:val="0"/>
+        </w:rPr>
+        <w:t xml:space="preserve">(Nel et al., 2016)</w:t>
+      </w:r>
+      <w:r>
+        <w:rPr>
+          <w:rtl w:val="0"/>
+        </w:rPr>
+        <w:t xml:space="preserve">, which can promote improved scientist-other actor relationships, increased evidence relevance, and build capacity both for researchers and practitioners/policymakers. However, such approaches also have trade-offs: they may be time consuming, expensive, or impractical in many situations, and may generate questions that researchers find uninteresting </w:t>
+      </w:r>
+      <w:r>
+        <w:rPr>
+          <w:color w:val="000000"/>
+          <w:rtl w:val="0"/>
+        </w:rPr>
+        <w:t xml:space="preserve">(Sutherland et al., 2017; Walsh et al., 2019)</w:t>
+      </w:r>
+      <w:r>
+        <w:rPr>
+          <w:rtl w:val="0"/>
+        </w:rPr>
+        <w:t xml:space="preserve">. While addressing specific issues such as accessibility, resources and capacity, and scientist-other actor relationships, as discussed below, could be beneficial, ultimately, a systemic shift in how evidence is valued and applied in conservation decisions is required to overcome the underlying causes.</w:t>
+      </w:r>
+    </w:p>
+    <w:p>
+      <w:pPr>
+        <w:spacing w:line="480" w:lineRule="auto"/>
+        <w:rPr/>
+      </w:pPr>
+      <w:r>
+        <w:rPr>
+          <w:rtl w:val="0"/>
+        </w:rPr>
+      </w:r>
+    </w:p>
+    <w:p>
+      <w:pPr>
+        <w:spacing w:line="480" w:lineRule="auto"/>
+        <w:rPr/>
+      </w:pPr>
+      <w:r>
+        <w:rPr>
+          <w:rtl w:val="0"/>
+        </w:rPr>
+        <w:t xml:space="preserve">In the conservation literature there is a strong focus on initiating and improving relationships via bridging or connecting the research and practice/policy communities </w:t>
+      </w:r>
+      <w:r>
+        <w:rPr>
+          <w:color w:val="000000"/>
+          <w:rtl w:val="0"/>
+        </w:rPr>
+        <w:t xml:space="preserve">(Kadykalo, Buxton, et al., 2021; Wyborn, 2015)</w:t>
+      </w:r>
+      <w:r>
+        <w:rPr>
+          <w:rtl w:val="0"/>
+        </w:rPr>
+        <w:t xml:space="preserve"> the use of knowledge brokers </w:t>
+      </w:r>
+      <w:r>
+        <w:rPr>
+          <w:color w:val="000000"/>
+          <w:rtl w:val="0"/>
+        </w:rPr>
+        <w:t xml:space="preserve">(Duncan et al., 2020)</w:t>
+      </w:r>
+      <w:r>
+        <w:rPr>
+          <w:rtl w:val="0"/>
+        </w:rPr>
+        <w:t xml:space="preserve">, or boundary spanners </w:t>
+      </w:r>
+      <w:r>
+        <w:rPr>
+          <w:color w:val="000000"/>
+          <w:rtl w:val="0"/>
+        </w:rPr>
+        <w:t xml:space="preserve">(Posner &amp; Cvitanovic, 2019).</w:t>
+      </w:r>
+      <w:r>
+        <w:rPr>
+          <w:rtl w:val="0"/>
+        </w:rPr>
+        <w:t xml:space="preserve"> At the same time, while interventions that aim to build strong relationships may facilitate communication and trust, they cannot on their own overcome structural constraints such as limited organisational capacity, misaligned incentives, or political and institutional pressures. As such, relationships should be understood as part of a wider system of conditions shaping evidence use, interacting with organisational, contextual, and evidentiary factors rather than operating independently. </w:t>
+      </w:r>
+    </w:p>
+    <w:p>
+      <w:pPr>
+        <w:spacing w:line="480" w:lineRule="auto"/>
+        <w:rPr/>
+      </w:pPr>
+      <w:r>
+        <w:rPr>
+          <w:rtl w:val="0"/>
+        </w:rPr>
+      </w:r>
+    </w:p>
+    <w:p>
+      <w:pPr>
+        <w:spacing w:line="480" w:lineRule="auto"/>
+        <w:rPr/>
+      </w:pPr>
+      <w:r>
+        <w:rPr>
+          <w:rtl w:val="0"/>
+        </w:rPr>
+        <w:t xml:space="preserve">Solutions relating to evidence characteristics are perhaps the most tractable of the issues we identified in this study, since they largely relate to how researchers produce research outputs. Attempts to improve relevance and accessibility include synthesising primary studies and making the resulting information freely available through initiatives such as Conservation Evidence </w:t>
+      </w:r>
+      <w:r>
+        <w:rPr>
+          <w:color w:val="000000"/>
+          <w:rtl w:val="0"/>
+        </w:rPr>
+        <w:t xml:space="preserve">(Sutherland et al., 2019)</w:t>
+      </w:r>
+      <w:r>
+        <w:rPr>
+          <w:rtl w:val="0"/>
+        </w:rPr>
+        <w:t xml:space="preserve"> and the Collaboration on Environmental Evidence. However, accessibility and relevance are insufficient, as evidence use is often impeded by the technical language and format used to communicate it. Conservation Evidence addresses this through structured, plain-language summaries of scientific publications on management effectiveness, while dedicated sections highlighting management implications in journals such as </w:t>
+      </w:r>
+      <w:r>
+        <w:rPr>
+          <w:i w:val="1"/>
+          <w:iCs w:val="1"/>
+          <w:rtl w:val="0"/>
+        </w:rPr>
+        <w:t xml:space="preserve">Journal of Applied Ecology</w:t>
+      </w:r>
+      <w:r>
+        <w:rPr>
+          <w:rtl w:val="0"/>
+        </w:rPr>
+        <w:t xml:space="preserve">, complement this approach </w:t>
+      </w:r>
+      <w:r>
+        <w:rPr>
+          <w:color w:val="000000"/>
+          <w:rtl w:val="0"/>
+        </w:rPr>
+        <w:t xml:space="preserve">(Groves et al., 2024)</w:t>
+      </w:r>
+      <w:r>
+        <w:rPr>
+          <w:rtl w:val="0"/>
+        </w:rPr>
+        <w:t xml:space="preserve">. We encourage more journals that publish applied biodiversity research to follow this example. Emerging tools such as generative artificial intelligence may further address problems of technical language by allowing more conversational, user-tailored access to evidence, although careful testing is required to manage risks related to bias and error </w:t>
+      </w:r>
+      <w:r>
+        <w:rPr>
+          <w:color w:val="000000"/>
+          <w:rtl w:val="0"/>
+        </w:rPr>
+        <w:t xml:space="preserve">(Iyer et al., 2025)</w:t>
+      </w:r>
+      <w:r>
+        <w:rPr>
+          <w:rtl w:val="0"/>
+        </w:rPr>
+        <w:t xml:space="preserve">. </w:t>
+      </w:r>
+    </w:p>
+    <w:p>
+      <w:pPr>
+        <w:spacing w:line="480" w:lineRule="auto"/>
+        <w:rPr/>
+      </w:pPr>
+      <w:r>
+        <w:rPr>
+          <w:rtl w:val="0"/>
+        </w:rPr>
+      </w:r>
+    </w:p>
+    <w:p>
+      <w:pPr>
+        <w:spacing w:line="480" w:lineRule="auto"/>
+        <w:rPr>
+          <w:color w:val="0b5394"/>
+        </w:rPr>
+      </w:pPr>
+      <w:r>
+        <w:rPr>
+          <w:rtl w:val="0"/>
+        </w:rPr>
+        <w:t xml:space="preserve">The importance of organisational factors such as capacity, leadership, incentives, and resourcing is well-established in the broader evidence use literature </w:t>
+      </w:r>
+      <w:r>
+        <w:rPr>
+          <w:color w:val="000000"/>
+          <w:rtl w:val="0"/>
+        </w:rPr>
+        <w:t xml:space="preserve">(Criado-Perez et al., 2020; Currie et al., 2020)</w:t>
+      </w:r>
+      <w:r>
+        <w:rPr>
+          <w:rtl w:val="0"/>
+        </w:rPr>
+        <w:t xml:space="preserve"> and addressing these factors can improve both evidence use and societal benefits </w:t>
+      </w:r>
+      <w:r>
+        <w:rPr>
+          <w:color w:val="000000"/>
+          <w:rtl w:val="0"/>
+        </w:rPr>
+        <w:t xml:space="preserve">(Boaz et al., 2024)</w:t>
+      </w:r>
+      <w:r>
+        <w:rPr>
+          <w:rtl w:val="0"/>
+        </w:rPr>
+        <w:t xml:space="preserve">. Despite this, much of the conservation literature focuses on factors more amenable to alteration, such as the formatting or dissemination of evidence. However, there are important structural reasons for this. Biodiversity conservation is chronically underfunded </w:t>
+      </w:r>
+      <w:r>
+        <w:rPr>
+          <w:color w:val="000000"/>
+          <w:rtl w:val="0"/>
+        </w:rPr>
+        <w:t xml:space="preserve">(Guénard et al., 2025; Waldron et al., 2013)</w:t>
+      </w:r>
+      <w:r>
+        <w:rPr>
+          <w:rtl w:val="0"/>
+        </w:rPr>
+        <w:t xml:space="preserve">. As such while interventions that aim to increase capacity and resourcing are often desirable, in many cases they may be unrealistic. This is in contrast with fields such as public health or education where organisations are typically larger and better resourced. </w:t>
+      </w:r>
+      <w:r>
+        <w:rPr>
+          <w:color w:val="0b5394"/>
+          <w:rtl w:val="0"/>
+        </w:rPr>
+        <w:t xml:space="preserve">Additionally the use of scientific evidence use may impose further costs on organisations (Fabian et al., 2019; Walsh et al., 2019), although the relative costs and benefits depend on the nature of conservation decision being made (Sutherland, 2022; Taylor et al., 2026; White et al., 2026).</w:t>
+      </w:r>
+    </w:p>
+    <w:p>
+      <w:pPr>
+        <w:spacing w:line="480" w:lineRule="auto"/>
+        <w:rPr/>
+      </w:pPr>
+      <w:r>
+        <w:rPr>
+          <w:rtl w:val="0"/>
+        </w:rPr>
+      </w:r>
+    </w:p>
+    <w:p>
+      <w:pPr>
+        <w:spacing w:line="480" w:lineRule="auto"/>
+        <w:rPr/>
+      </w:pPr>
+      <w:r>
+        <w:rPr>
+          <w:b w:val="1"/>
+          <w:bCs w:val="1"/>
+          <w:rtl w:val="0"/>
+        </w:rPr>
+        <w:t xml:space="preserve">Biases and methodological limitations</w:t>
+      </w:r>
+      <w:r>
+        <w:rPr>
+          <w:rtl w:val="0"/>
+        </w:rPr>
+      </w:r>
+    </w:p>
+    <w:p>
+      <w:pPr>
+        <w:spacing w:line="480" w:lineRule="auto"/>
+        <w:rPr/>
+      </w:pPr>
+      <w:r>
+        <w:rPr>
+          <w:rtl w:val="0"/>
+        </w:rPr>
+        <w:t xml:space="preserve">Our study has a number of important caveats relating to the conceptualisation of the factors influencing evidence use and the methods we used. First, the frequency with which factors are mentioned does not necessarily indicate their relative importance, whether they were presented as barriers or enablers to evidence use, or their magnitude of influence. </w:t>
+      </w:r>
+      <w:r>
+        <w:rPr>
+          <w:color w:val="0b5394"/>
+          <w:rtl w:val="0"/>
+        </w:rPr>
+        <w:t xml:space="preserve">We recommend that future syntheses assess in what contexts each specific factor impedes or facilitates the use of evidence as well as more focused syntheses that address a specific conservation context or topic (e.g. Kapoor et al., 2025).</w:t>
+      </w:r>
+      <w:r>
+        <w:rPr>
+          <w:rtl w:val="0"/>
+        </w:rPr>
+        <w:t xml:space="preserve"> </w:t>
+      </w:r>
+      <w:r>
+        <w:rPr>
+          <w:color w:val="0b5394"/>
+          <w:rtl w:val="0"/>
+        </w:rPr>
+        <w:t xml:space="preserve">Most studies in the systematic map elicited people’s opinions about factors influencing evidence use and so responses could be subject to availability bias, resulting in examples that come easily to mind being assumed to be more important than they are in reality (Tversky &amp; Kahneman, 1974). Future studies could reduce the risk of such biases by combining open-ended questions with more structured prompts, asking about recent specific decisions, and using structured expert solicitation methods such as the Delphi technique (Hemming et al., 2018; Martin et al., 2012). </w:t>
+      </w:r>
+      <w:r>
+        <w:rPr>
+          <w:rtl w:val="0"/>
+        </w:rPr>
+        <w:t xml:space="preserve">Equally, the factors we identified are interlinked, not independent of each other meaning that once one barrier is overcome, other factors are likely to become more important.</w:t>
+      </w:r>
+    </w:p>
+    <w:p>
+      <w:pPr>
+        <w:spacing w:line="480" w:lineRule="auto"/>
+        <w:rPr/>
+      </w:pPr>
+      <w:r>
+        <w:rPr>
+          <w:rtl w:val="0"/>
+        </w:rPr>
+      </w:r>
+    </w:p>
+    <w:p>
+      <w:pPr>
+        <w:spacing w:line="480" w:lineRule="auto"/>
+        <w:rPr/>
+      </w:pPr>
+      <w:r>
+        <w:rPr>
+          <w:rtl w:val="0"/>
+        </w:rPr>
+        <w:t xml:space="preserve">While we largely followed best-practice guidelines for conducting systematic maps </w:t>
+      </w:r>
+      <w:r>
+        <w:rPr>
+          <w:color w:val="000000"/>
+          <w:rtl w:val="0"/>
+        </w:rPr>
+        <w:t xml:space="preserve">(Collaboration for Environmental Evidence, 2018)</w:t>
+      </w:r>
+      <w:r>
+        <w:rPr>
+          <w:rtl w:val="0"/>
+        </w:rPr>
+        <w:t xml:space="preserve">, time and resource constraints to our project meant that it was necessary to drop some elements, such as a publicly available a priori protocol. We did however share such a protocol within the review team (see supplementary methods). </w:t>
+      </w:r>
+      <w:r>
+        <w:rPr>
+          <w:color w:val="0b5394"/>
+          <w:rtl w:val="0"/>
+        </w:rPr>
+        <w:t xml:space="preserve">We did not search for or include studies in non-English languages or grey literature and this likely magnified the bias towards studies being conducted in English-speaking countries (Hannah et al., 2024; Nuñez &amp; Amano, 2021), as well as leading to an underestimation of the proportion of studies citing the importance of language barriers. </w:t>
+      </w:r>
+      <w:r>
+        <w:rPr>
+          <w:rtl w:val="0"/>
+        </w:rPr>
+        <w:t xml:space="preserve">Finally, we did not conduct critical appraisal - a process which assesses the robustness and validity of studies included in synthesis </w:t>
+      </w:r>
+      <w:r>
+        <w:rPr>
+          <w:color w:val="000000"/>
+          <w:rtl w:val="0"/>
+        </w:rPr>
+        <w:t xml:space="preserve">(Collaboration for Environmental Evidence, 2018; Stanhope &amp; Weinstein, 2022)</w:t>
+      </w:r>
+      <w:r>
+        <w:rPr>
+          <w:rtl w:val="0"/>
+        </w:rPr>
+        <w:t xml:space="preserve">. Given the wide variation in the robustness of qualitative research in conservation </w:t>
+      </w:r>
+      <w:r>
+        <w:rPr>
+          <w:color w:val="000000"/>
+          <w:rtl w:val="0"/>
+        </w:rPr>
+        <w:t xml:space="preserve">(Moon et al., 2016; O’Brien et al., 2014; Young et al., 2018)</w:t>
+      </w:r>
+      <w:r>
+        <w:rPr>
+          <w:rtl w:val="0"/>
+        </w:rPr>
+        <w:t xml:space="preserve">, we recommend such an assessment in future follow-up studies.</w:t>
+      </w:r>
+    </w:p>
+    <w:p>
+      <w:pPr>
+        <w:spacing w:line="480" w:lineRule="auto"/>
+        <w:rPr/>
+      </w:pPr>
+      <w:r>
+        <w:rPr>
+          <w:rtl w:val="0"/>
+        </w:rPr>
+      </w:r>
+    </w:p>
+    <w:p>
+      <w:pPr>
+        <w:spacing w:line="480" w:lineRule="auto"/>
+        <w:rPr>
+          <w:b w:val="1"/>
+          <w:bCs w:val="1"/>
+        </w:rPr>
+      </w:pPr>
+      <w:r>
+        <w:rPr>
+          <w:b w:val="1"/>
+          <w:bCs w:val="1"/>
+          <w:rtl w:val="0"/>
+        </w:rPr>
+        <w:t xml:space="preserve">Conclusions</w:t>
+      </w:r>
+    </w:p>
+    <w:p>
+      <w:pPr>
+        <w:spacing w:line="480" w:lineRule="auto"/>
+        <w:rPr>
+          <w:color w:val="0b5394"/>
+        </w:rPr>
+      </w:pPr>
+      <w:r>
+        <w:rPr>
+          <w:color w:val="0b5394"/>
+          <w:rtl w:val="0"/>
+        </w:rPr>
+        <w:t xml:space="preserve">In order to improve evidence use, it is vital that researchers move beyond documenting barriers and towards identifying and explicitly testing solutions. The complex, interlinked nature of the different factors impacting evidence use means that interventions that address multiple barriers at once are particularly important. Approaches such as knowledge co-production, embedding scientists within organisations, and knowledge brokering have the potential to simultaneously improve relationships between scientists and decision-makers, increase the relevance and accessibility of evidence, and support positive attitudes to evidence use in organisations (Cvitanovic et al., 2015; Norström et al., 2020). Although these approaches are increasingly used in conservation (Rosemartin et al., 2023), there are relatively few explicit evaluations of their effectiveness. Future research should prioritise testing interventions using quasi-experimental counterfactual approaches, comparative case studies of different interventions, and evaluations of organisational change over time. Doing this would facilitate a shift from advocating for the importance of evidence-based conservation to identifying how scientific evidence can be effectively incorporated into conservation decision-making (Taylor et al., 2026). </w:t>
+      </w:r>
+    </w:p>
+    <w:p>
+      <w:pPr>
+        <w:spacing w:line="480" w:lineRule="auto"/>
+        <w:rPr>
+          <w:color w:val="0b5394"/>
+        </w:rPr>
+      </w:pPr>
+      <w:r>
+        <w:rPr>
+          <w:rtl w:val="0"/>
+        </w:rPr>
+      </w:r>
+    </w:p>
+    <w:p>
+      <w:pPr>
+        <w:spacing w:line="480" w:lineRule="auto"/>
+        <w:rPr>
+          <w:color w:val="0b5394"/>
+        </w:rPr>
+      </w:pPr>
+      <w:r>
+        <w:rPr>
+          <w:color w:val="0b5394"/>
+          <w:rtl w:val="0"/>
+        </w:rPr>
+        <w:t xml:space="preserve">For practitioners and policymakers, our findings reinforce the value of sustained relationships and collaboration with researchers throughout the decision-making process. </w:t>
+      </w:r>
+      <w:sdt>
+        <w:sdtPr>
+          <w:id w:val="-1640728149"/>
+          <w:tag w:val="goog_rdk_9"/>
+        </w:sdtPr>
+        <w:sdtContent>
+          <w:commentRangeStart w:id="6"/>
+        </w:sdtContent>
+      </w:sdt>
+      <w:r>
+        <w:rPr>
+          <w:color w:val="0b5394"/>
+          <w:rtl w:val="0"/>
+        </w:rPr>
+        <w:t xml:space="preserve">We recommend that decision-makers engage early with researchers when defining management or policy questions, clearly articulate priority knowledge needs, and invest in mechanisms that facilitate dialogue and interpretation of evidence.</w:t>
+      </w:r>
+      <w:commentRangeEnd w:id="6"/>
+      <w:r>
+        <w:commentReference w:id="6"/>
+      </w:r>
+      <w:r>
+        <w:rPr>
+          <w:color w:val="0b5394"/>
+          <w:rtl w:val="0"/>
+        </w:rPr>
+        <w:t xml:space="preserve"> However, our synthesis also underscores that expectations around evidence-informed practice must be realistic given the chronic under-resourcing of conservation organisations (Guénard et al., 2025; Waldron et al., 2013). Given this context, efforts to improve evidence use should be prioritised based on the potential consequences of incorrect decisions and the degree of uncertainty associated with them (Taylor et al., 2026). Where risks and uncertainty are relatively low, limited investment in evidence use may be justified. In contrast, where decisions are associated with high uncertainty or potentially large conservation or social consequences, greater investment in improving evidence use is likely to be beneficial (Taylor et al., 2026).</w:t>
+      </w:r>
+    </w:p>
+    <w:p>
+      <w:pPr>
+        <w:spacing w:line="480" w:lineRule="auto"/>
+        <w:rPr>
+          <w:color w:val="0b5394"/>
+        </w:rPr>
+      </w:pPr>
+      <w:r>
+        <w:rPr>
+          <w:rtl w:val="0"/>
+        </w:rPr>
+      </w:r>
+    </w:p>
+    <w:p>
+      <w:pPr>
+        <w:spacing w:line="480" w:lineRule="auto"/>
+        <w:rPr/>
+      </w:pPr>
+      <w:r>
+        <w:rPr>
+          <w:color w:val="0b5394"/>
+          <w:rtl w:val="0"/>
+        </w:rPr>
+        <w:t xml:space="preserve">Finally, improving evidence use requires institutional support and conducive political conditions. Recent reductions in research funding in some countries, including the recent massive cuts to research spending in the USA (Donald, 2025), threaten the long-term capacities needed to support evidence-based decisions.</w:t>
+      </w:r>
+      <w:r>
+        <w:rPr>
+          <w:rtl w:val="0"/>
+        </w:rPr>
+        <w:t xml:space="preserve"> At the same time, there is increasing recognition of the importance of Indigenous leadership and diverse knowledge systems in conservation. Although our review focused specifically on scientific evidence, future work should continue to explore how differe</w:t>
+      </w:r>
+      <w:sdt>
+        <w:sdtPr>
+          <w:id w:val="1074225241"/>
+          <w:tag w:val="goog_rdk_10"/>
+        </w:sdtPr>
+        <w:sdtContent>
+          <w:commentRangeStart w:id="7"/>
+        </w:sdtContent>
+      </w:sdt>
+      <w:r>
+        <w:rPr>
+          <w:rtl w:val="0"/>
+        </w:rPr>
+        <w:t xml:space="preserve">nt </w:t>
+      </w:r>
+      <w:sdt>
+        <w:sdtPr>
+          <w:id w:val="-845651854"/>
+          <w:tag w:val="goog_rdk_11"/>
+        </w:sdtPr>
+        <w:sdtContent>
+          <w:ins w:author="Violeta Furlan" w:id="1" w:date="2026-06-05T15:08:06Z">
             <w:r>
               <w:rPr>
-                <w:color w:val="0b5394"/>
                 <w:rtl w:val="0"/>
               </w:rPr>
-              <w:t xml:space="preserve">.</w:t>
+              <w:t xml:space="preserve">ways of knowing</w:t>
+            </w:r>
+            <w:commentRangeEnd w:id="7"/>
+            <w:r>
+              <w:commentReference w:id="7"/>
+            </w:r>
+            <w:r>
+              <w:rPr>
+                <w:rtl w:val="0"/>
+              </w:rPr>
+              <w:t xml:space="preserve"> </w:t>
             </w:r>
           </w:ins>
         </w:sdtContent>
       </w:sdt>
       <w:sdt>
         <w:sdtPr>
-          <w:id w:val="718294971"/>
-          <w:tag w:val="goog_rdk_9"/>
+          <w:id w:val="-2084125595"/>
+          <w:tag w:val="goog_rdk_12"/>
         </w:sdtPr>
         <w:sdtContent>
-          <w:del w:author="Santiago Perea Arroyo" w:id="3" w:date="2026-06-04T21:42:35Z">
+          <w:del w:author="Violeta Furlan" w:id="1" w:date="2026-06-05T15:08:06Z">
             <w:r>
               <w:rPr>
-                <w:color w:val="0b5394"/>
                 <w:rtl w:val="0"/>
               </w:rPr>
-              <w:delText xml:space="preserve">,</w:delText>
+              <w:delText xml:space="preserve">forms of knowledge</w:delText>
             </w:r>
           </w:del>
         </w:sdtContent>
       </w:sdt>
       <w:r>
         <w:rPr>
-          <w:color w:val="0b5394"/>
-          <w:rtl w:val="0"/>
-        </w:rPr>
-        <w:t xml:space="preserve"> </w:t>
-      </w:r>
-      <w:sdt>
-        <w:sdtPr>
-          <w:id w:val="-1178965855"/>
-          <w:tag w:val="goog_rdk_10"/>
-        </w:sdtPr>
-        <w:sdtContent>
-          <w:del w:author="Santiago Perea Arroyo" w:id="4" w:date="2026-06-04T21:42:39Z">
-            <w:r>
-              <w:rPr>
-                <w:color w:val="0b5394"/>
-                <w:rtl w:val="0"/>
-              </w:rPr>
-              <w:delText xml:space="preserve">h</w:delText>
-            </w:r>
-          </w:del>
-        </w:sdtContent>
-      </w:sdt>
-      <w:sdt>
-        <w:sdtPr>
-          <w:id w:val="-1794326819"/>
-          <w:tag w:val="goog_rdk_11"/>
-        </w:sdtPr>
-        <w:sdtContent>
-          <w:ins w:author="Santiago Perea Arroyo" w:id="4" w:date="2026-06-04T21:42:39Z">
-            <w:r>
-              <w:rPr>
-                <w:color w:val="0b5394"/>
-                <w:rtl w:val="0"/>
-              </w:rPr>
-              <w:t xml:space="preserve">H</w:t>
-            </w:r>
-          </w:ins>
-        </w:sdtContent>
-      </w:sdt>
-      <w:r>
-        <w:rPr>
-          <w:color w:val="0b5394"/>
-          <w:rtl w:val="0"/>
-        </w:rPr>
-        <w:t xml:space="preserve">owever, future research should aim to identify whether there are unique factors that impede the use of evidence, such as political and resource constraints, or limited internet connectivity preventing access to databases and scientific studies. </w:t>
-      </w:r>
-    </w:p>
-    <w:p>
-      <w:pPr>
-        <w:spacing w:line="480" w:lineRule="auto"/>
-        <w:rPr>
-          <w:color w:val="0b5394"/>
-        </w:rPr>
-      </w:pPr>
-      <w:r>
-        <w:rPr>
-          <w:rtl w:val="0"/>
-        </w:rPr>
-      </w:r>
-    </w:p>
-    <w:p>
-      <w:pPr>
-        <w:spacing w:line="480" w:lineRule="auto"/>
-        <w:rPr>
-          <w:color w:val="0b5394"/>
-        </w:rPr>
-      </w:pPr>
-      <w:r>
-        <w:rPr>
-          <w:color w:val="0b5394"/>
-          <w:rtl w:val="0"/>
-        </w:rPr>
-        <w:t xml:space="preserve">Many of the studies we identified did not report the ecosystem type or conservation threat that organisations focused on. Rather than purely being indicative of a lack of reporting by researchers, </w:t>
-      </w:r>
-      <w:sdt>
-        <w:sdtPr>
-          <w:id w:val="-461816020"/>
-          <w:tag w:val="goog_rdk_12"/>
-        </w:sdtPr>
-        <w:sdtContent>
-          <w:commentRangeStart w:id="2"/>
-        </w:sdtContent>
-      </w:sdt>
-      <w:r>
-        <w:rPr>
-          <w:color w:val="0b5394"/>
-          <w:rtl w:val="0"/>
-        </w:rPr>
-        <w:t xml:space="preserve">this</w:t>
-      </w:r>
-      <w:commentRangeEnd w:id="2"/>
-      <w:r>
-        <w:commentReference w:id="2"/>
-      </w:r>
-      <w:r>
-        <w:rPr>
-          <w:color w:val="0b5394"/>
-          <w:rtl w:val="0"/>
-        </w:rPr>
-        <w:t xml:space="preserve"> likely reflects the breadth of most primary studies, which normally focused on multiple conservation organisations, that worked in a wide range of different ecosystems and dealt with a variety of conservation threats. This is reflected by the large number of government and statutory bodies which were the focus of studies and the fact that around 50% of decision contexts studied were related to regional to international scales. However, given the importance of context in how evidence is used, we urge researchers on this topic to provide more detailed descriptions of the contexts in which studies were undertaken. Doing this would allow for a comparison of how the factors impacting the use of scientific evidence vary across contexts and identification of topics for which more research is needed or not, thereby reducing research waste (Grainger et al., 2020; Purgar et al., 2022).</w:t>
-      </w:r>
-    </w:p>
-    <w:p>
-      <w:pPr>
-        <w:spacing w:line="480" w:lineRule="auto"/>
-        <w:rPr>
-          <w:b w:val="1"/>
-          <w:bCs w:val="1"/>
-        </w:rPr>
-      </w:pPr>
-      <w:r>
-        <w:rPr>
-          <w:rtl w:val="0"/>
-        </w:rPr>
-      </w:r>
-    </w:p>
-    <w:p>
-      <w:pPr>
-        <w:spacing w:line="480" w:lineRule="auto"/>
-        <w:rPr/>
-      </w:pPr>
-      <w:r>
-        <w:rPr>
-          <w:b w:val="1"/>
-          <w:bCs w:val="1"/>
-          <w:rtl w:val="0"/>
-        </w:rPr>
-        <w:t xml:space="preserve">Factors influencing scientific evidence use </w:t>
-      </w:r>
-      <w:r>
-        <w:rPr>
-          <w:rtl w:val="0"/>
-        </w:rPr>
-      </w:r>
-    </w:p>
-    <w:p>
-      <w:pPr>
-        <w:spacing w:line="480" w:lineRule="auto"/>
-        <w:rPr>
-          <w:color w:val="0b5394"/>
-        </w:rPr>
-      </w:pPr>
-      <w:r>
-        <w:rPr>
-          <w:rtl w:val="0"/>
-        </w:rPr>
-        <w:t xml:space="preserve">A large proportion of primary studies identified characteristics of scientific evidence itself as influencing its use. Relevance was particularly prominent amongst these and is a recurring theme in conservation, where biodiversity outcomes from management can be highly context dependent </w:t>
-      </w:r>
-      <w:r>
-        <w:rPr>
-          <w:color w:val="000000"/>
-          <w:rtl w:val="0"/>
-        </w:rPr>
-        <w:t xml:space="preserve">(Cook et al., 2013)</w:t>
-      </w:r>
-      <w:r>
-        <w:rPr>
-          <w:rtl w:val="0"/>
-        </w:rPr>
-        <w:t xml:space="preserve">. What determined relevance was rarely defined, but the studies often mentioned that data available at large scales were not relevant to local scale decisions </w:t>
-      </w:r>
-      <w:r>
-        <w:rPr>
-          <w:color w:val="000000"/>
-          <w:rtl w:val="0"/>
-        </w:rPr>
-        <w:t xml:space="preserve">(Gagné et al., 2020; Jacaban et al., 2022; Miljand &amp; Eckerberg, 2022; Rasmussen et al., 2017)</w:t>
-      </w:r>
-      <w:r>
-        <w:rPr>
-          <w:rtl w:val="0"/>
-        </w:rPr>
-        <w:t xml:space="preserve">. As such, relevance is likely influenced by the ecological, cultural and socioeconomic similarities between the contexts in which scientific evidence is generated and the decision context </w:t>
-      </w:r>
-      <w:r>
-        <w:rPr>
-          <w:color w:val="000000"/>
-          <w:rtl w:val="0"/>
-        </w:rPr>
-        <w:t xml:space="preserve">(Adams &amp; Sandbrook, 2013; Christie et al., 2020, 2023)</w:t>
-      </w:r>
-      <w:r>
-        <w:rPr>
-          <w:rtl w:val="0"/>
-        </w:rPr>
-        <w:t xml:space="preserve">. </w:t>
-      </w:r>
-      <w:sdt>
-        <w:sdtPr>
-          <w:id w:val="840783154"/>
-          <w:tag w:val="goog_rdk_13"/>
-        </w:sdtPr>
-        <w:sdtContent>
-          <w:commentRangeStart w:id="3"/>
-        </w:sdtContent>
-      </w:sdt>
-      <w:r>
-        <w:rPr>
-          <w:rtl w:val="0"/>
-        </w:rPr>
-        <w:t xml:space="preserve">The format and style of language used to communicate scientific evidence was frequently cited as influencing evidence use, which reflects scientists’ training to write for disciplinary specialists using technical language </w:t>
-      </w:r>
-      <w:r>
-        <w:rPr>
-          <w:color w:val="000000"/>
-          <w:rtl w:val="0"/>
-        </w:rPr>
-        <w:t xml:space="preserve">(Fazey et al., 2005)</w:t>
-      </w:r>
-      <w:r>
-        <w:rPr>
-          <w:rtl w:val="0"/>
-        </w:rPr>
-        <w:t xml:space="preserve">, but can limit the interpretability and usability of evidence for practitioners and policymakers </w:t>
-      </w:r>
-      <w:r>
-        <w:rPr>
-          <w:color w:val="000000"/>
-          <w:rtl w:val="0"/>
-        </w:rPr>
-        <w:t xml:space="preserve">(Barrett &amp; Rodriguez, 2021; Cvitanovic et al., 2016; Karam-Gemael et al., 2018)</w:t>
-      </w:r>
-      <w:r>
-        <w:rPr>
-          <w:rtl w:val="0"/>
-        </w:rPr>
-        <w:t xml:space="preserve">. </w:t>
-      </w:r>
-      <w:commentRangeEnd w:id="3"/>
-      <w:r>
-        <w:commentReference w:id="3"/>
-      </w:r>
-      <w:r>
-        <w:rPr>
-          <w:rtl w:val="0"/>
-        </w:rPr>
-        <w:t xml:space="preserve">Accessibility of evidence was frequently mentioned in studies and reviews and has long been recognised as influencing evidence use (Pullin et al., 2004), but remains a problem due both to paywalls and difficulties in finding information </w:t>
-      </w:r>
-      <w:r>
-        <w:rPr>
-          <w:color w:val="000000"/>
-          <w:rtl w:val="0"/>
-        </w:rPr>
-        <w:t xml:space="preserve">(Cook et al., 2012; Fabian et al., 2019; Walsh et al., 2019)</w:t>
-      </w:r>
-      <w:r>
-        <w:rPr>
-          <w:rtl w:val="0"/>
-        </w:rPr>
-        <w:t xml:space="preserve">. </w:t>
-      </w:r>
-      <w:r>
-        <w:rPr>
-          <w:color w:val="0b5394"/>
-          <w:rtl w:val="0"/>
-        </w:rPr>
-        <w:t xml:space="preserve">The rigour of evidence was regularly highlighted as influencing its uptake, mainly noting the perceived trustworthiness of scientific evidence (Lemieux et al., 2018). However, in contrast, a number of studies highlighted the concerns of decision-makers that data generated by models (Peters et al., 2018) and by citizen science (Suškevičs et al., 2021) may be less trustworthy than empirical data collected by trained scientists.</w:t>
-      </w:r>
-    </w:p>
-    <w:p>
-      <w:pPr>
-        <w:spacing w:line="480" w:lineRule="auto"/>
-        <w:rPr>
-          <w:b w:val="1"/>
-          <w:bCs w:val="1"/>
-        </w:rPr>
-      </w:pPr>
-      <w:r>
-        <w:rPr>
-          <w:rtl w:val="0"/>
-        </w:rPr>
-      </w:r>
-    </w:p>
-    <w:p>
-      <w:pPr>
-        <w:spacing w:line="480" w:lineRule="auto"/>
-        <w:rPr/>
-      </w:pPr>
-      <w:r>
-        <w:rPr>
-          <w:rtl w:val="0"/>
-        </w:rPr>
-        <w:t xml:space="preserve">The importance of relationships in shaping decision processes is well recognised </w:t>
-      </w:r>
-      <w:r>
-        <w:rPr>
-          <w:color w:val="000000"/>
-          <w:rtl w:val="0"/>
-        </w:rPr>
-        <w:t xml:space="preserve">(Gray, 2016; Noble &amp; Fulton, 2020; Walsh et al., 2019)</w:t>
-      </w:r>
-      <w:r>
-        <w:rPr>
-          <w:rtl w:val="0"/>
-        </w:rPr>
-        <w:t xml:space="preserve"> and our results reflect the vital role of relationships between researchers and practitioners/policymakers. Decisions are not made through neutral application of information, but are embedded within social interactions, norms, and expectations between actors </w:t>
-      </w:r>
-      <w:r>
-        <w:rPr>
-          <w:color w:val="000000"/>
-          <w:rtl w:val="0"/>
-        </w:rPr>
-        <w:t xml:space="preserve">(Lejano, 2021)</w:t>
-      </w:r>
-      <w:r>
-        <w:rPr>
-          <w:rtl w:val="0"/>
-        </w:rPr>
-        <w:t xml:space="preserve">. One key aspect of relationships between scientists and practitioners/policymakers was simply whether there was any contact and communication at all </w:t>
-      </w:r>
-      <w:r>
-        <w:rPr>
-          <w:color w:val="000000"/>
-          <w:rtl w:val="0"/>
-        </w:rPr>
-        <w:t xml:space="preserve">(Yocum et al., 2022)</w:t>
-      </w:r>
-      <w:r>
-        <w:rPr>
-          <w:rtl w:val="0"/>
-        </w:rPr>
-        <w:t xml:space="preserve">, which often facilitated overcoming barriers such as lack of access to evidence or difficulty in understanding technical language </w:t>
-      </w:r>
-      <w:r>
-        <w:rPr>
-          <w:color w:val="000000"/>
-          <w:rtl w:val="0"/>
-        </w:rPr>
-        <w:t xml:space="preserve">(Noble &amp; Fulton, 2020)</w:t>
-      </w:r>
-      <w:r>
-        <w:rPr>
-          <w:rtl w:val="0"/>
-        </w:rPr>
-        <w:t xml:space="preserve">. Additionally, trust in researchers and the research they produce plays an important role in shaping perceptions of the credibility and legitimacy of scientific evidence and the recommendations derived from it. Our findings therefore align with broader literature suggesting that relationships act as an enabling condition for evidence use, rather than a substitute for evidence quality or relevance</w:t>
-      </w:r>
-      <w:sdt>
-        <w:sdtPr>
-          <w:id w:val="1930817712"/>
-          <w:tag w:val="goog_rdk_14"/>
-        </w:sdtPr>
-        <w:sdtContent>
-          <w:commentRangeStart w:id="4"/>
-        </w:sdtContent>
-      </w:sdt>
-      <w:r>
-        <w:rPr>
-          <w:rtl w:val="0"/>
-        </w:rPr>
-        <w:t xml:space="preserve">.</w:t>
-      </w:r>
-      <w:commentRangeEnd w:id="4"/>
-      <w:r>
-        <w:commentReference w:id="4"/>
-      </w:r>
-      <w:r>
-        <w:rPr>
-          <w:rtl w:val="0"/>
-        </w:rPr>
-      </w:r>
-    </w:p>
-    <w:p>
-      <w:pPr>
-        <w:spacing w:line="480" w:lineRule="auto"/>
-        <w:rPr/>
-      </w:pPr>
-      <w:r>
-        <w:rPr>
-          <w:rtl w:val="0"/>
-        </w:rPr>
-      </w:r>
-    </w:p>
-    <w:p>
-      <w:pPr>
-        <w:spacing w:line="480" w:lineRule="auto"/>
-        <w:rPr/>
-      </w:pPr>
-      <w:r>
-        <w:rPr>
-          <w:rtl w:val="0"/>
-        </w:rPr>
-        <w:t xml:space="preserve">Our results indicate that organisational factors, individual capacity, and decision context play key roles in shaping the use of scientific evidence. In particular, the influence of organisational capacity and resources is likely to be a major constraint. Most conservation organisations operate with limited funding and small teams </w:t>
-      </w:r>
-      <w:r>
-        <w:rPr>
-          <w:color w:val="000000"/>
-          <w:rtl w:val="0"/>
-        </w:rPr>
-        <w:t xml:space="preserve">(Armsworth et al., 2012)</w:t>
-      </w:r>
-      <w:r>
-        <w:rPr>
-          <w:rtl w:val="0"/>
-        </w:rPr>
-        <w:t xml:space="preserve">, leaving staff with little time to search for, interpret, and apply scientific evidence. Linked to this, many staff in conservation organisations also feel that they lack the technical skills to read and interpret scientific evidence, with evidence use often more common among practitioners with higher levels of formal education or scientific training </w:t>
-      </w:r>
-      <w:r>
-        <w:rPr>
-          <w:color w:val="000000"/>
-          <w:rtl w:val="0"/>
-        </w:rPr>
-        <w:t xml:space="preserve">(Lemieux et al., 2018)</w:t>
-      </w:r>
-      <w:r>
-        <w:rPr>
-          <w:rtl w:val="0"/>
-        </w:rPr>
-        <w:t xml:space="preserve">. The social, political, and economic context was also frequently cited in studies we found, reflecting the fact that the wider decision-context is important in determining whether scientific evidence informs practice and policy. Use of evidence on topics that are politically contentious in some contexts, such as the use of climate change data for conservation strategies in US states, highlight this issue </w:t>
-      </w:r>
-      <w:r>
-        <w:rPr>
-          <w:color w:val="000000"/>
-          <w:rtl w:val="0"/>
-        </w:rPr>
-        <w:t xml:space="preserve">(Peters et al., 2018; Rasmussen et al., 2017; Yocum et al., 2022)</w:t>
-      </w:r>
-      <w:r>
-        <w:rPr>
-          <w:rtl w:val="0"/>
-        </w:rPr>
-        <w:t xml:space="preserve">.</w:t>
-      </w:r>
-    </w:p>
-    <w:p>
-      <w:pPr>
-        <w:spacing w:after="240" w:before="240" w:line="480" w:lineRule="auto"/>
-        <w:rPr>
-          <w:b w:val="1"/>
-          <w:bCs w:val="1"/>
-        </w:rPr>
-      </w:pPr>
-      <w:r>
-        <w:rPr>
-          <w:rtl w:val="0"/>
-        </w:rPr>
-        <w:t xml:space="preserve">Relatively few studies identified factors associated with the characteristics of researchers and research organisations as influencing the use of scientific evidence. This is somewhat surprising given long-standing concerns that academic incentive structures prioritise novel findings and high-impact journals (Shanley &amp; López, 2009) and disadvantage the production of policy- or practice-relevant evidence (Dedeurwaerdere et al., 2026). We found that researchers’ knowledge of policy and practice was relatively frequently cited, aligning with previous work showing that researchers’ perceptions of what constitutes relevant or useful evidence often differ substantially from those of practitioners and policymakers (Cook, Mascia, et al., 2013). However, the limited attention paid to researcher and research organisation characteristics in the conservation evidence-use literature does not indicate that they are unimportant, but should be seen as a knowledge gap and research priority.</w:t>
-      </w:r>
-      <w:r>
-        <w:rPr>
-          <w:rtl w:val="0"/>
-        </w:rPr>
-      </w:r>
-    </w:p>
-    <w:p>
-      <w:pPr>
-        <w:spacing w:line="480" w:lineRule="auto"/>
-        <w:rPr>
-          <w:b w:val="1"/>
-          <w:bCs w:val="1"/>
-        </w:rPr>
-      </w:pPr>
-      <w:r>
-        <w:rPr>
-          <w:rtl w:val="0"/>
-        </w:rPr>
-      </w:r>
-    </w:p>
-    <w:p>
-      <w:pPr>
-        <w:spacing w:line="480" w:lineRule="auto"/>
-        <w:rPr/>
-      </w:pPr>
-      <w:r>
-        <w:rPr>
-          <w:b w:val="1"/>
-          <w:bCs w:val="1"/>
-          <w:rtl w:val="0"/>
-        </w:rPr>
-        <w:t xml:space="preserve">Potential solutions</w:t>
-      </w:r>
-      <w:r>
-        <w:rPr>
-          <w:rtl w:val="0"/>
-        </w:rPr>
-      </w:r>
-    </w:p>
-    <w:p>
-      <w:pPr>
-        <w:spacing w:line="480" w:lineRule="auto"/>
-        <w:rPr/>
-      </w:pPr>
-      <w:r>
-        <w:rPr>
-          <w:rtl w:val="0"/>
-        </w:rPr>
-        <w:t xml:space="preserve">Given the diversity and interrelatedness of the factors influencing the use of scientific evidence, the conservation sector must focus on delivering cross-cutting solutions that address multiple barriers. One such widely recognised cross-cutting solution is the use of knowledge co-production and participatory approaches </w:t>
-      </w:r>
-      <w:r>
-        <w:rPr>
-          <w:color w:val="000000"/>
-          <w:rtl w:val="0"/>
-        </w:rPr>
-        <w:t xml:space="preserve">(Nel et al., 2016)</w:t>
-      </w:r>
-      <w:r>
-        <w:rPr>
-          <w:rtl w:val="0"/>
-        </w:rPr>
-        <w:t xml:space="preserve">, which can promote improved scientist-other actor relationships, increased evidence relevance, and build capacity both for researchers and practitioners/policymakers. However, such approaches also have trade-offs: they may be time consuming, expensive, or impractical in many situations, and may generate questions that researchers find uninteresting </w:t>
-      </w:r>
-      <w:r>
-        <w:rPr>
-          <w:color w:val="000000"/>
-          <w:rtl w:val="0"/>
-        </w:rPr>
-        <w:t xml:space="preserve">(Sutherland et al., 2017; Walsh et al., 2019)</w:t>
-      </w:r>
-      <w:r>
-        <w:rPr>
-          <w:rtl w:val="0"/>
-        </w:rPr>
-        <w:t xml:space="preserve">. While addressing specific issues such as accessibility, resources and capacity, and scientist-other actor relationships, as discussed below, could be beneficial, ultimately, a systemic shift in how evidence is valued and applied in conservation decisions is required to overcome the underlying causes.</w:t>
-      </w:r>
-    </w:p>
-    <w:p>
-      <w:pPr>
-        <w:spacing w:line="480" w:lineRule="auto"/>
-        <w:rPr/>
-      </w:pPr>
-      <w:r>
-        <w:rPr>
-          <w:rtl w:val="0"/>
-        </w:rPr>
-      </w:r>
-    </w:p>
-    <w:p>
-      <w:pPr>
-        <w:spacing w:line="480" w:lineRule="auto"/>
-        <w:rPr/>
-      </w:pPr>
-      <w:r>
-        <w:rPr>
-          <w:rtl w:val="0"/>
-        </w:rPr>
-        <w:t xml:space="preserve">In the conservation literature there is a strong focus on initiating and improving relationships via bridging or connecting the research and practice/policy communities </w:t>
-      </w:r>
-      <w:r>
-        <w:rPr>
-          <w:color w:val="000000"/>
-          <w:rtl w:val="0"/>
-        </w:rPr>
-        <w:t xml:space="preserve">(Kadykalo, Buxton, et al., 2021; Wyborn, 2015)</w:t>
-      </w:r>
-      <w:r>
-        <w:rPr>
-          <w:rtl w:val="0"/>
-        </w:rPr>
-        <w:t xml:space="preserve"> the use of knowledge brokers </w:t>
-      </w:r>
-      <w:r>
-        <w:rPr>
-          <w:color w:val="000000"/>
-          <w:rtl w:val="0"/>
-        </w:rPr>
-        <w:t xml:space="preserve">(Duncan et al., 2020)</w:t>
-      </w:r>
-      <w:r>
-        <w:rPr>
-          <w:rtl w:val="0"/>
-        </w:rPr>
-        <w:t xml:space="preserve">, or boundary spanners </w:t>
-      </w:r>
-      <w:r>
-        <w:rPr>
-          <w:color w:val="000000"/>
-          <w:rtl w:val="0"/>
-        </w:rPr>
-        <w:t xml:space="preserve">(Posner &amp; Cvitanovic, 2019).</w:t>
-      </w:r>
-      <w:r>
-        <w:rPr>
-          <w:rtl w:val="0"/>
-        </w:rPr>
-        <w:t xml:space="preserve"> At the same time, while interventions that aim to build strong relationships may facilitate communication and trust, they cannot on their own overcome structural constraints such as limited organisational capacity, misaligned incentives, or political and institutional pressures. As such, relationships should be understood as part of a wider system of conditions shaping evidence use, interacting with organisational, contextual, and evidentiary factors rather than operating independently. </w:t>
-      </w:r>
-    </w:p>
-    <w:p>
-      <w:pPr>
-        <w:spacing w:line="480" w:lineRule="auto"/>
-        <w:rPr/>
-      </w:pPr>
-      <w:r>
-        <w:rPr>
-          <w:rtl w:val="0"/>
-        </w:rPr>
-      </w:r>
-    </w:p>
-    <w:p>
-      <w:pPr>
-        <w:spacing w:line="480" w:lineRule="auto"/>
-        <w:rPr/>
-      </w:pPr>
-      <w:r>
-        <w:rPr>
-          <w:rtl w:val="0"/>
-        </w:rPr>
-        <w:t xml:space="preserve">Solutions relating to evidence characteristics are perhaps the most tractable of the issues we identified in this study, since they largely relate to how researchers produce research outputs. Attempts to improve relevance and accessibility include synthesising primary studies and making the resulting information freely available through initiatives such as Conservation Evidence </w:t>
-      </w:r>
-      <w:r>
-        <w:rPr>
-          <w:color w:val="000000"/>
-          <w:rtl w:val="0"/>
-        </w:rPr>
-        <w:t xml:space="preserve">(Sutherland et al., 2019)</w:t>
-      </w:r>
-      <w:r>
-        <w:rPr>
-          <w:rtl w:val="0"/>
-        </w:rPr>
-        <w:t xml:space="preserve"> and the Collaboration on Environmental Evidence. However, accessibility and relevance are insufficient, as evidence use is often impeded by the technical language and format used to communicate it. Conservation Evidence addresses this through structured, plain-language summaries of scientific publications on management effectiveness, while dedicated sections highlighting management implications in journals such as </w:t>
-      </w:r>
-      <w:r>
-        <w:rPr>
-          <w:i w:val="1"/>
-          <w:iCs w:val="1"/>
-          <w:rtl w:val="0"/>
-        </w:rPr>
-        <w:t xml:space="preserve">Journal of Applied Ecology</w:t>
-      </w:r>
-      <w:r>
-        <w:rPr>
-          <w:rtl w:val="0"/>
-        </w:rPr>
-        <w:t xml:space="preserve">, complement this approach </w:t>
-      </w:r>
-      <w:r>
-        <w:rPr>
-          <w:color w:val="000000"/>
-          <w:rtl w:val="0"/>
-        </w:rPr>
-        <w:t xml:space="preserve">(Groves et al., 2024)</w:t>
-      </w:r>
-      <w:r>
-        <w:rPr>
-          <w:rtl w:val="0"/>
-        </w:rPr>
-        <w:t xml:space="preserve">. We encourage more journals that publish applied biodiversity research to follow this example. Emerging tools such as generative artificial intelligence may further address problems of technical language by allowing more conversational, user-tailored access to evidence, although careful testing is required to manage risks related to bias and error </w:t>
-      </w:r>
-      <w:r>
-        <w:rPr>
-          <w:color w:val="000000"/>
-          <w:rtl w:val="0"/>
-        </w:rPr>
-        <w:t xml:space="preserve">(Iyer et al., 2025)</w:t>
-      </w:r>
-      <w:r>
-        <w:rPr>
-          <w:rtl w:val="0"/>
-        </w:rPr>
-        <w:t xml:space="preserve">. </w:t>
-      </w:r>
-    </w:p>
-    <w:p>
-      <w:pPr>
-        <w:spacing w:line="480" w:lineRule="auto"/>
-        <w:rPr/>
-      </w:pPr>
-      <w:r>
-        <w:rPr>
-          <w:rtl w:val="0"/>
-        </w:rPr>
-      </w:r>
-    </w:p>
-    <w:p>
-      <w:pPr>
-        <w:spacing w:line="480" w:lineRule="auto"/>
-        <w:rPr>
-          <w:color w:val="0b5394"/>
-        </w:rPr>
-      </w:pPr>
-      <w:r>
-        <w:rPr>
-          <w:rtl w:val="0"/>
-        </w:rPr>
-        <w:t xml:space="preserve">The importance of organisational factors such as capacity, leadership, incentives, and resourcing is well-established in the broader evidence use literature </w:t>
-      </w:r>
-      <w:r>
-        <w:rPr>
-          <w:color w:val="000000"/>
-          <w:rtl w:val="0"/>
-        </w:rPr>
-        <w:t xml:space="preserve">(Criado-Perez et al., 2020; Currie et al., 2020)</w:t>
-      </w:r>
-      <w:r>
-        <w:rPr>
-          <w:rtl w:val="0"/>
-        </w:rPr>
-        <w:t xml:space="preserve"> and addressing these factors can improve both evidence use and societal benefits </w:t>
-      </w:r>
-      <w:r>
-        <w:rPr>
-          <w:color w:val="000000"/>
-          <w:rtl w:val="0"/>
-        </w:rPr>
-        <w:t xml:space="preserve">(Boaz et al., 2024)</w:t>
-      </w:r>
-      <w:r>
-        <w:rPr>
-          <w:rtl w:val="0"/>
-        </w:rPr>
-        <w:t xml:space="preserve">. Despite this, much of the conservation literature focuses on factors more amenable to alteration, such as the formatting or dissemination of evidence. However, there are important structural reasons for this. Biodiversity conservation is chronically underfunded </w:t>
-      </w:r>
-      <w:r>
-        <w:rPr>
-          <w:color w:val="000000"/>
-          <w:rtl w:val="0"/>
-        </w:rPr>
-        <w:t xml:space="preserve">(Guénard et al., 2025; Waldron et al., 2013)</w:t>
-      </w:r>
-      <w:r>
-        <w:rPr>
-          <w:rtl w:val="0"/>
-        </w:rPr>
-        <w:t xml:space="preserve">. As such while interventions that aim to increase capacity and resourcing are often desirable, in many cases they may be unrealistic. This is in contrast with fields such as public health or education where organisations are typically larger and better resourced. </w:t>
-      </w:r>
-      <w:r>
-        <w:rPr>
-          <w:color w:val="0b5394"/>
-          <w:rtl w:val="0"/>
-        </w:rPr>
-        <w:t xml:space="preserve">Additionally the use of scientific evidence use may impose further costs on organisations (Fabian et al., 2019; Walsh et al., 2019), although the relative costs and benefits depend on the nature of conservation decision being made (Sutherland, 2022; Taylor et al., 2026; White et al., 2026).</w:t>
-      </w:r>
-    </w:p>
-    <w:p>
-      <w:pPr>
-        <w:spacing w:line="480" w:lineRule="auto"/>
-        <w:rPr/>
-      </w:pPr>
-      <w:r>
-        <w:rPr>
-          <w:rtl w:val="0"/>
-        </w:rPr>
-      </w:r>
-    </w:p>
-    <w:p>
-      <w:pPr>
-        <w:spacing w:line="480" w:lineRule="auto"/>
-        <w:rPr/>
-      </w:pPr>
-      <w:r>
-        <w:rPr>
-          <w:b w:val="1"/>
-          <w:bCs w:val="1"/>
-          <w:rtl w:val="0"/>
-        </w:rPr>
-        <w:t xml:space="preserve">Biases and methodological limitations</w:t>
-      </w:r>
-      <w:r>
-        <w:rPr>
-          <w:rtl w:val="0"/>
-        </w:rPr>
-      </w:r>
-    </w:p>
-    <w:p>
-      <w:pPr>
-        <w:spacing w:line="480" w:lineRule="auto"/>
-        <w:rPr/>
-      </w:pPr>
-      <w:r>
-        <w:rPr>
-          <w:rtl w:val="0"/>
-        </w:rPr>
-        <w:t xml:space="preserve">Our study has a number of important caveats relating to the conceptualisation of the factors influencing evidence use and the methods we used. First, the frequency with which factors are mentioned does not necessarily indicate their relative importance, whether they were presented as barriers or enablers to evidence use, or their magnitude of influence. </w:t>
-      </w:r>
-      <w:r>
-        <w:rPr>
-          <w:color w:val="0b5394"/>
-          <w:rtl w:val="0"/>
-        </w:rPr>
-        <w:t xml:space="preserve">We recommend that future syntheses assess in what contexts each specific factor impedes or facilitates the use of evidence as well as more focused syntheses that address a specific conservation context or topic (e.g. Kapoor et al., 2025).</w:t>
-      </w:r>
-      <w:r>
-        <w:rPr>
-          <w:rtl w:val="0"/>
-        </w:rPr>
-        <w:t xml:space="preserve"> </w:t>
-      </w:r>
-      <w:r>
-        <w:rPr>
-          <w:color w:val="0b5394"/>
-          <w:rtl w:val="0"/>
-        </w:rPr>
-        <w:t xml:space="preserve">Most studies in the systematic map elicited people’s opinions about factors influencing evidence use and so responses could be subject to availability bias, resulting in examples that come easily to mind being assumed to be more important than they are in reality (Tversky &amp; Kahneman, 1974). Future studies could reduce the risk of such biases by combining open-ended questions with more structured prompts, asking about recent specific decisions, and using structured expert solicitation methods such as the Delphi technique (Hemming et al., 2018; Martin et al., 2012). </w:t>
-      </w:r>
-      <w:r>
-        <w:rPr>
-          <w:rtl w:val="0"/>
-        </w:rPr>
-        <w:t xml:space="preserve">Equally, the factors we identified are interlinked, not independent of each other meaning that once one barrier is overcome, other factors are likely to become more important.</w:t>
-      </w:r>
-    </w:p>
-    <w:p>
-      <w:pPr>
-        <w:spacing w:line="480" w:lineRule="auto"/>
-        <w:rPr/>
-      </w:pPr>
-      <w:r>
-        <w:rPr>
-          <w:rtl w:val="0"/>
-        </w:rPr>
-      </w:r>
-    </w:p>
-    <w:p>
-      <w:pPr>
-        <w:spacing w:line="480" w:lineRule="auto"/>
-        <w:rPr/>
-      </w:pPr>
-      <w:r>
-        <w:rPr>
-          <w:rtl w:val="0"/>
-        </w:rPr>
-        <w:t xml:space="preserve">While we largely followed best-practice guidelines for conducting systematic maps </w:t>
-      </w:r>
-      <w:r>
-        <w:rPr>
-          <w:color w:val="000000"/>
-          <w:rtl w:val="0"/>
-        </w:rPr>
-        <w:t xml:space="preserve">(Collaboration for Environmental Evidence, 2018)</w:t>
-      </w:r>
-      <w:r>
-        <w:rPr>
-          <w:rtl w:val="0"/>
-        </w:rPr>
-        <w:t xml:space="preserve">, time and resource constraints to our project meant that it was necessary to drop some elements, such as a publicly available a priori protocol. We did however share such a protocol within the review team (see supplementary methods). </w:t>
-      </w:r>
-      <w:r>
-        <w:rPr>
-          <w:color w:val="0b5394"/>
-          <w:rtl w:val="0"/>
-        </w:rPr>
-        <w:t xml:space="preserve">We did not search for or include studies in non-English languages or grey literature and this likely magnified the bias towards studies being conducted in English-speaking countries (Hannah et al., 2024; Nuñez &amp; Amano, 2021), as well as leading to an underestimation of the proportion of studies citing the importance of language barriers. </w:t>
-      </w:r>
-      <w:r>
-        <w:rPr>
-          <w:rtl w:val="0"/>
-        </w:rPr>
-        <w:t xml:space="preserve">Finally, we did not conduct critical appraisal - a process which assesses the robustness and validity of studies included in synthesis </w:t>
-      </w:r>
-      <w:r>
-        <w:rPr>
-          <w:color w:val="000000"/>
-          <w:rtl w:val="0"/>
-        </w:rPr>
-        <w:t xml:space="preserve">(Collaboration for Environmental Evidence, 2018; Stanhope &amp; Weinstein, 2022)</w:t>
-      </w:r>
-      <w:r>
-        <w:rPr>
-          <w:rtl w:val="0"/>
-        </w:rPr>
-        <w:t xml:space="preserve">. Given the wide variation in the robustness of qualitative research in conservation </w:t>
-      </w:r>
-      <w:r>
-        <w:rPr>
-          <w:color w:val="000000"/>
-          <w:rtl w:val="0"/>
-        </w:rPr>
-        <w:t xml:space="preserve">(Moon et al., 2016; O’Brien et al., 2014; Young et al., 2018)</w:t>
-      </w:r>
-      <w:r>
-        <w:rPr>
-          <w:rtl w:val="0"/>
-        </w:rPr>
-        <w:t xml:space="preserve">, we recommend such an assessment in future follow-up studies.</w:t>
-      </w:r>
-    </w:p>
-    <w:p>
-      <w:pPr>
-        <w:spacing w:line="480" w:lineRule="auto"/>
-        <w:rPr/>
-      </w:pPr>
-      <w:r>
-        <w:rPr>
-          <w:rtl w:val="0"/>
-        </w:rPr>
-      </w:r>
-    </w:p>
-    <w:p>
-      <w:pPr>
-        <w:spacing w:line="480" w:lineRule="auto"/>
-        <w:rPr>
-          <w:b w:val="1"/>
-          <w:bCs w:val="1"/>
-        </w:rPr>
-      </w:pPr>
-      <w:r>
-        <w:rPr>
-          <w:b w:val="1"/>
-          <w:bCs w:val="1"/>
-          <w:rtl w:val="0"/>
-        </w:rPr>
-        <w:t xml:space="preserve">Conclusions</w:t>
-      </w:r>
-    </w:p>
-    <w:p>
-      <w:pPr>
-        <w:spacing w:line="480" w:lineRule="auto"/>
-        <w:rPr>
-          <w:color w:val="0b5394"/>
-        </w:rPr>
-      </w:pPr>
-      <w:r>
-        <w:rPr>
-          <w:color w:val="0b5394"/>
-          <w:rtl w:val="0"/>
-        </w:rPr>
-        <w:t xml:space="preserve">In order to improve evidence use, it is vital that researchers move beyond documenting barriers and towards identifying and explicitly testing solutions. The complex, interlinked nature of the different factors impacting evidence use means that interventions that address multiple barriers at once are particularly important. Approaches such as knowledge co-production, embedding scientists within organisations, and knowledge brokering have the potential to simultaneously improve relationships between scientists and decision-makers, increase the relevance and accessibility of evidence, and support positive attitudes to evidence use in organisations (Cvitanovic et al., 2015; Norström et al., 2020). Although these approaches are increasingly used in conservation (Rosemartin et al., 2023), there are relatively few explicit evaluations of their effectiveness. Future research should prioritise testing interventions using quasi-experimental counterfactual approaches, comparative case studies of different interventions, and evaluations of organisational change over time. Doing this would facilitate a shift from advocating for the importance of evidence-based conservation to identifying how scientific evidence can be effectively incorporated into conservation decision-making (Taylor et al., 2026). </w:t>
-      </w:r>
-    </w:p>
-    <w:p>
-      <w:pPr>
-        <w:spacing w:line="480" w:lineRule="auto"/>
-        <w:rPr>
-          <w:color w:val="0b5394"/>
-        </w:rPr>
-      </w:pPr>
-      <w:r>
-        <w:rPr>
-          <w:rtl w:val="0"/>
-        </w:rPr>
-      </w:r>
-    </w:p>
-    <w:p>
-      <w:pPr>
-        <w:spacing w:line="480" w:lineRule="auto"/>
-        <w:rPr>
-          <w:color w:val="0b5394"/>
-        </w:rPr>
-      </w:pPr>
-      <w:r>
-        <w:rPr>
-          <w:color w:val="0b5394"/>
-          <w:rtl w:val="0"/>
-        </w:rPr>
-        <w:t xml:space="preserve">For practitioners and policymakers, our findings reinforce the value of sustained relationships and collaboration with researchers throughout the decision-making process. </w:t>
-      </w:r>
-      <w:sdt>
-        <w:sdtPr>
-          <w:id w:val="1998949406"/>
-          <w:tag w:val="goog_rdk_15"/>
-        </w:sdtPr>
-        <w:sdtContent>
-          <w:commentRangeStart w:id="5"/>
-        </w:sdtContent>
-      </w:sdt>
-      <w:r>
-        <w:rPr>
-          <w:color w:val="0b5394"/>
-          <w:rtl w:val="0"/>
-        </w:rPr>
-        <w:t xml:space="preserve">We recommend that decision-makers engage early with researchers when defining management or policy questions, clearly articulate priority knowledge needs, and invest in mechanisms that facilitate dialogue and interpretation of evidence.</w:t>
-      </w:r>
-      <w:commentRangeEnd w:id="5"/>
-      <w:r>
-        <w:commentReference w:id="5"/>
-      </w:r>
-      <w:r>
-        <w:rPr>
-          <w:color w:val="0b5394"/>
-          <w:rtl w:val="0"/>
-        </w:rPr>
-        <w:t xml:space="preserve"> However, our synthesis also underscores that expectations around evidence-informed practice must be realistic given the chronic under-resourcing of conservation organisations (Guénard et al., 2025; Waldron et al., 2013). Given this context, efforts to improve evidence use should be prioritised based on the potential consequences of incorrect decisions and the degree of uncertainty associated with them (Taylor et al., 2026). Where risks and uncertainty are relatively low, limited investment in evidence use may be justified. In contrast, where decisions are associated with high uncertainty or potentially large conservation or social consequences, greater investment in improving evidence use is likely to be beneficial (Taylor et al., 2026).</w:t>
-      </w:r>
-    </w:p>
-    <w:p>
-      <w:pPr>
-        <w:spacing w:line="480" w:lineRule="auto"/>
-        <w:rPr>
-          <w:color w:val="0b5394"/>
-        </w:rPr>
-      </w:pPr>
-      <w:r>
-        <w:rPr>
-          <w:rtl w:val="0"/>
-        </w:rPr>
-      </w:r>
-    </w:p>
-    <w:p>
-      <w:pPr>
-        <w:spacing w:line="480" w:lineRule="auto"/>
-        <w:rPr/>
-      </w:pPr>
-      <w:r>
-        <w:rPr>
-          <w:color w:val="0b5394"/>
-          <w:rtl w:val="0"/>
-        </w:rPr>
-        <w:t xml:space="preserve">Finally, improving evidence use requires institutional support and conducive political conditions. Recent reductions in research funding in some countries, including the recent massive cuts to research spending in the USA (Donald, 2025), threaten the long-term capacities needed to support evidence-based decisions.</w:t>
-      </w:r>
-      <w:r>
-        <w:rPr>
-          <w:rtl w:val="0"/>
-        </w:rPr>
-        <w:t xml:space="preserve"> At the same time, there is increasing recognition of the importance of Indigenous leadership and diverse knowledge systems in conservation. Although our review focused specifically on scientific evidence, future work should continue to explore how different forms of knowledge can be combined transparently, since, despite much work on this topic, this is still challenging to do in practice </w:t>
+          <w:rtl w:val="0"/>
+        </w:rPr>
+        <w:t xml:space="preserve"> can be combined transparently, since, despite much work on this topic, this is still challenging to do in practice </w:t>
       </w:r>
       <w:r>
         <w:rPr>
@@ -7818,8 +7815,8 @@
       </w:r>
       <w:sdt>
         <w:sdtPr>
-          <w:id w:val="-953085718"/>
-          <w:tag w:val="goog_rdk_16"/>
+          <w:id w:val="1532930076"/>
+          <w:tag w:val="goog_rdk_13"/>
         </w:sdtPr>
         <w:sdtContent>
           <w:r>
@@ -7827,7 +7824,7 @@
               <w:i w:val="1"/>
               <w:iCs w:val="1"/>
               <w:rtl w:val="0"/>
-              <w:rPrChange w:author="Philip Anthony Martin" w:id="5" w:date="2026-05-27T10:45:00Z">
+              <w:rPrChange w:author="Philip Anthony Martin" w:id="2" w:date="2026-05-27T10:45:00Z">
                 <w:rPr/>
               </w:rPrChange>
             </w:rPr>
@@ -11573,7 +11570,7 @@
 
 <file path=word/comments.xml><?xml version="1.0" encoding="utf-8"?>
 <w:comments xmlns:mc="http://schemas.openxmlformats.org/markup-compatibility/2006" xmlns:o="urn:schemas-microsoft-com:office:office" xmlns:r="http://schemas.openxmlformats.org/officeDocument/2006/relationships" xmlns:m="http://schemas.openxmlformats.org/officeDocument/2006/math" xmlns:v="urn:schemas-microsoft-com:vml" xmlns:wp="http://schemas.openxmlformats.org/drawingml/2006/wordprocessingDrawing" xmlns:w10="urn:schemas-microsoft-com:office:word" xmlns:w="http://schemas.openxmlformats.org/wordprocessingml/2006/main" xmlns:wne="http://schemas.microsoft.com/office/word/2006/wordml" xmlns:sl="http://schemas.openxmlformats.org/schemaLibrary/2006/main" xmlns:a="http://schemas.openxmlformats.org/drawingml/2006/main" xmlns:pic="http://schemas.openxmlformats.org/drawingml/2006/picture" xmlns:c="http://schemas.openxmlformats.org/drawingml/2006/chart" xmlns:lc="http://schemas.openxmlformats.org/drawingml/2006/lockedCanvas" xmlns:dgm="http://schemas.openxmlformats.org/drawingml/2006/diagram" xmlns:wps="http://schemas.microsoft.com/office/word/2010/wordprocessingShape" xmlns:wpg="http://schemas.microsoft.com/office/word/2010/wordprocessingGroup" xmlns:w14="http://schemas.microsoft.com/office/word/2010/wordml" xmlns:w15="http://schemas.microsoft.com/office/word/2012/wordml" xmlns:w16="http://schemas.microsoft.com/office/word/2018/wordml" xmlns:w16cex="http://schemas.microsoft.com/office/word/2018/wordml/cex" xmlns:w16cid="http://schemas.microsoft.com/office/word/2016/wordml/cid" xmlns="http://schemas.microsoft.com/office/tasks/2019/documenttasks" xmlns:cr="http://schemas.microsoft.com/office/comments/2020/reactions">
-  <w:comment w:author="Santiago Perea Arroyo" w:id="2" w:date="2026-06-04T21:44:59Z">
+  <w:comment w:author="Violeta Furlan" w:id="7" w:date="2026-06-05T15:09:38Z">
     <w:p>
       <w:pPr>
         <w:keepNext w:val="0"/>
@@ -11624,11 +11621,11 @@
           <w:vertAlign w:val="baseline"/>
           <w:rtl w:val="0"/>
         </w:rPr>
-        <w:t xml:space="preserve">this gap?</w:t>
+        <w:t xml:space="preserve">This is the most accurate term to represent the concept</w:t>
       </w:r>
     </w:p>
   </w:comment>
-  <w:comment w:author="Noelia Zafra Calvo" w:id="4" w:date="2026-06-02T14:43:14Z">
+  <w:comment w:author="Violeta Furlan" w:id="3" w:date="2026-06-05T14:49:58Z">
     <w:p>
       <w:pPr>
         <w:keepNext w:val="0"/>
@@ -11679,11 +11676,11 @@
           <w:vertAlign w:val="baseline"/>
           <w:rtl w:val="0"/>
         </w:rPr>
-        <w:t xml:space="preserve">If scientists can be "colleagues" of practitioners they will use much more the scientific evidence produced, as practitioners rely on knowledge interchange between colleagues as a primary form of acquire evidence.</w:t>
+        <w:t xml:space="preserve">This citation may fit here:  https://doi.org/10.1098/rstb.2019.0011</w:t>
       </w:r>
     </w:p>
   </w:comment>
-  <w:comment w:author="Elina Takola" w:id="5" w:date="2026-06-02T08:50:37Z">
+  <w:comment w:author="Cátia Matos" w:id="0" w:date="2026-06-09T09:00:16Z">
     <w:p>
       <w:pPr>
         <w:keepNext w:val="0"/>
@@ -11734,11 +11731,11 @@
           <w:vertAlign w:val="baseline"/>
           <w:rtl w:val="0"/>
         </w:rPr>
-        <w:t xml:space="preserve">And researchers can put more effort in creating policy briefs that translate their research findings to practitioners in a clear and efficient way.</w:t>
+        <w:t xml:space="preserve">We could provide examples of what we mean by other groups.</w:t>
       </w:r>
     </w:p>
   </w:comment>
-  <w:comment w:author="Noelia Zafra Calvo" w:id="3" w:date="2026-06-02T14:39:07Z">
+  <w:comment w:author="Noelia Zafra Calvo" w:id="4" w:date="2026-06-02T14:43:14Z">
     <w:p>
       <w:pPr>
         <w:keepNext w:val="0"/>
@@ -11789,11 +11786,11 @@
           <w:vertAlign w:val="baseline"/>
           <w:rtl w:val="0"/>
         </w:rPr>
-        <w:t xml:space="preserve">Another point here is that most of the "evidence" is written in English, so it is more likely to be used for English-speaking persons and professionals</w:t>
+        <w:t xml:space="preserve">If scientists can be "colleagues" of practitioners they will use much more the scientific evidence produced, as practitioners rely on knowledge interchange between colleagues as a primary form of acquire evidence.</w:t>
       </w:r>
     </w:p>
   </w:comment>
-  <w:comment w:author="Elina Takola" w:id="0" w:date="2026-06-02T08:41:13Z">
+  <w:comment w:author="Philip Martin" w:id="5" w:date="2026-06-08T16:11:17Z">
     <w:p>
       <w:pPr>
         <w:keepNext w:val="0"/>
@@ -11844,11 +11841,11 @@
           <w:vertAlign w:val="baseline"/>
           <w:rtl w:val="0"/>
         </w:rPr>
-        <w:t xml:space="preserve">So if I got this right the fourth bar (from left) of Fig. 2b has none of these types?</w:t>
+        <w:t xml:space="preserve">I agree with this point and we make reference to the idea of embedding scientists in practitioner organisations in the conclusions.</w:t>
       </w:r>
     </w:p>
   </w:comment>
-  <w:comment w:author="Philip Martin" w:id="1" w:date="2026-06-03T10:47:47Z">
+  <w:comment w:author="Elina Takola" w:id="6" w:date="2026-06-02T08:50:37Z">
     <w:p>
       <w:pPr>
         <w:keepNext w:val="0"/>
@@ -11899,6 +11896,116 @@
           <w:vertAlign w:val="baseline"/>
           <w:rtl w:val="0"/>
         </w:rPr>
+        <w:t xml:space="preserve">And researchers can put more effort in creating policy briefs that translate their research findings to practitioners in a clear and efficient way.</w:t>
+      </w:r>
+    </w:p>
+  </w:comment>
+  <w:comment w:author="Elina Takola" w:id="1" w:date="2026-06-02T08:41:13Z">
+    <w:p>
+      <w:pPr>
+        <w:keepNext w:val="0"/>
+        <w:keepLines w:val="0"/>
+        <w:pageBreakBefore w:val="0"/>
+        <w:widowControl w:val="0"/>
+        <w:pBdr>
+          <w:top w:space="0" w:sz="0" w:val="nil"/>
+          <w:left w:space="0" w:sz="0" w:val="nil"/>
+          <w:bottom w:space="0" w:sz="0" w:val="nil"/>
+          <w:right w:space="0" w:sz="0" w:val="nil"/>
+          <w:between w:space="0" w:sz="0" w:val="nil"/>
+        </w:pBdr>
+        <w:shd w:fill="auto" w:val="clear"/>
+        <w:spacing w:after="0" w:before="0" w:line="240" w:lineRule="auto"/>
+        <w:ind w:left="0" w:right="0" w:firstLine="0"/>
+        <w:jc w:val="left"/>
+        <w:rPr>
+          <w:rFonts w:ascii="Arial" w:cs="Arial" w:eastAsia="Arial" w:hAnsi="Arial"/>
+          <w:b w:val="0"/>
+          <w:bCs w:val="0"/>
+          <w:i w:val="0"/>
+          <w:iCs w:val="0"/>
+          <w:smallCaps w:val="0"/>
+          <w:strike w:val="0"/>
+          <w:color w:val="000000"/>
+          <w:sz w:val="22"/>
+          <w:szCs w:val="22"/>
+          <w:u w:val="none"/>
+          <w:shd w:fill="auto" w:val="clear"/>
+          <w:vertAlign w:val="baseline"/>
+        </w:rPr>
+      </w:pPr>
+      <w:r>
+        <w:rPr>
+          <w:rFonts w:ascii="Arial" w:cs="Arial" w:eastAsia="Arial" w:hAnsi="Arial"/>
+          <w:b w:val="0"/>
+          <w:bCs w:val="0"/>
+          <w:i w:val="0"/>
+          <w:iCs w:val="0"/>
+          <w:smallCaps w:val="0"/>
+          <w:strike w:val="0"/>
+          <w:color w:val="000000"/>
+          <w:sz w:val="22"/>
+          <w:szCs w:val="22"/>
+          <w:u w:val="none"/>
+          <w:shd w:fill="auto" w:val="clear"/>
+          <w:vertAlign w:val="baseline"/>
+          <w:rtl w:val="0"/>
+        </w:rPr>
+        <w:t xml:space="preserve">So if I got this right the fourth bar (from left) of Fig. 2b has none of these types?</w:t>
+      </w:r>
+    </w:p>
+  </w:comment>
+  <w:comment w:author="Philip Martin" w:id="2" w:date="2026-06-03T10:47:47Z">
+    <w:p>
+      <w:pPr>
+        <w:keepNext w:val="0"/>
+        <w:keepLines w:val="0"/>
+        <w:pageBreakBefore w:val="0"/>
+        <w:widowControl w:val="0"/>
+        <w:pBdr>
+          <w:top w:space="0" w:sz="0" w:val="nil"/>
+          <w:left w:space="0" w:sz="0" w:val="nil"/>
+          <w:bottom w:space="0" w:sz="0" w:val="nil"/>
+          <w:right w:space="0" w:sz="0" w:val="nil"/>
+          <w:between w:space="0" w:sz="0" w:val="nil"/>
+        </w:pBdr>
+        <w:shd w:fill="auto" w:val="clear"/>
+        <w:spacing w:after="0" w:before="0" w:line="240" w:lineRule="auto"/>
+        <w:ind w:left="0" w:right="0" w:firstLine="0"/>
+        <w:jc w:val="left"/>
+        <w:rPr>
+          <w:rFonts w:ascii="Arial" w:cs="Arial" w:eastAsia="Arial" w:hAnsi="Arial"/>
+          <w:b w:val="0"/>
+          <w:bCs w:val="0"/>
+          <w:i w:val="0"/>
+          <w:iCs w:val="0"/>
+          <w:smallCaps w:val="0"/>
+          <w:strike w:val="0"/>
+          <w:color w:val="000000"/>
+          <w:sz w:val="22"/>
+          <w:szCs w:val="22"/>
+          <w:u w:val="none"/>
+          <w:shd w:fill="auto" w:val="clear"/>
+          <w:vertAlign w:val="baseline"/>
+        </w:rPr>
+      </w:pPr>
+      <w:r>
+        <w:rPr>
+          <w:rFonts w:ascii="Arial" w:cs="Arial" w:eastAsia="Arial" w:hAnsi="Arial"/>
+          <w:b w:val="0"/>
+          <w:bCs w:val="0"/>
+          <w:i w:val="0"/>
+          <w:iCs w:val="0"/>
+          <w:smallCaps w:val="0"/>
+          <w:strike w:val="0"/>
+          <w:color w:val="000000"/>
+          <w:sz w:val="22"/>
+          <w:szCs w:val="22"/>
+          <w:u w:val="none"/>
+          <w:shd w:fill="auto" w:val="clear"/>
+          <w:vertAlign w:val="baseline"/>
+          <w:rtl w:val="0"/>
+        </w:rPr>
         <w:t xml:space="preserve">Well spotted. I'll have a look at th ecode and work out what is going on.</w:t>
       </w:r>
     </w:p>
@@ -11912,8 +12019,10 @@
   <w15:commentEx w15:paraId="0000013F" w15:done="0"/>
   <w15:commentEx w15:paraId="00000140" w15:done="0"/>
   <w15:commentEx w15:paraId="00000141" w15:done="0"/>
-  <w15:commentEx w15:paraId="00000142" w15:done="0"/>
-  <w15:commentEx w15:paraId="00000143" w15:paraIdParent="00000142" w15:done="0"/>
+  <w15:commentEx w15:paraId="00000142" w15:paraIdParent="00000141" w15:done="0"/>
+  <w15:commentEx w15:paraId="00000143" w15:done="0"/>
+  <w15:commentEx w15:paraId="00000144" w15:done="0"/>
+  <w15:commentEx w15:paraId="00000145" w15:paraIdParent="00000144" w15:done="0"/>
 </w15:commentsEx>
 </file>
 
@@ -12632,7 +12741,7 @@
 
 <file path=customXML/item1.xml><?xml version="1.0" encoding="utf-8"?>
 <go:gDocsCustomXmlDataStorage xmlns:go="http://customooxmlschemas.google.com/" xmlns:r="http://schemas.openxmlformats.org/officeDocument/2006/relationships" uri="GoogleDocsCustomDataVersion2">
-  <go:docsCustomData xmlns:go="http://customooxmlschemas.google.com/" roundtripDataSignature="AMtx7mgrRGl6QfBd6YbLYq/TcU1fYjLC0Q==">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</go:docsCustomData>
+  <go:docsCustomData xmlns:go="http://customooxmlschemas.google.com/" roundtripDataSignature="AMtx7mgVzKhc0wEAM75LH9o3c+o/SgCnMg==">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</go:docsCustomData>
 </go:gDocsCustomXmlDataStorage>
 </file>
 

</xml_diff>